<commit_message>
TS 1.5-1.8 Ghanam Jatai In progress
</commit_message>
<xml_diff>
--- a/TS Jatai Ghanam Project/TS 1.5/TS 1.5 Jatai Tamil Corrections.docx
+++ b/TS Jatai Ghanam Project/TS 1.5/TS 1.5 Jatai Tamil Corrections.docx
@@ -62,16 +62,14 @@
         <w:rPr>
           <w:b/>
           <w:bCs/>
-          <w:sz w:val="28"/>
-          <w:szCs w:val="32"/>
+          <w:szCs w:val="24"/>
         </w:rPr>
       </w:pPr>
       <w:r>
         <w:rPr>
           <w:b/>
           <w:bCs/>
-          <w:sz w:val="28"/>
-          <w:szCs w:val="32"/>
+          <w:szCs w:val="24"/>
         </w:rPr>
         <w:t>(ignore those which are already incorporated in your book’s version and date)</w:t>
       </w:r>
@@ -155,176 +153,585 @@
           </w:tcPr>
           <w:p>
             <w:pPr>
-              <w:widowControl w:val="0"/>
               <w:autoSpaceDE w:val="0"/>
               <w:autoSpaceDN w:val="0"/>
               <w:adjustRightInd w:val="0"/>
-              <w:spacing w:before="0" w:line="240" w:lineRule="auto"/>
-              <w:rPr>
-                <w:rFonts w:ascii="BRH Devanagari Extra" w:hAnsi="BRH Devanagari Extra" w:cs="BRH Devanagari Extra"/>
-                <w:color w:val="000000"/>
-                <w:sz w:val="32"/>
-                <w:szCs w:val="40"/>
+              <w:rPr>
+                <w:rFonts w:ascii="Latha" w:hAnsi="Latha" w:cs="Latha"/>
+                <w:szCs w:val="28"/>
+                <w:lang w:bidi="ta-IN"/>
               </w:rPr>
             </w:pPr>
             <w:r>
               <w:rPr>
-                <w:rFonts w:cs="BRH Devanagari Extra"/>
-                <w:color w:val="000000"/>
-                <w:szCs w:val="40"/>
+                <w:rFonts w:cs="Latha"/>
+                <w:b/>
+                <w:bCs/>
+                <w:szCs w:val="28"/>
+                <w:cs/>
+                <w:lang w:bidi="ta-IN"/>
               </w:rPr>
               <w:t>57</w:t>
             </w:r>
             <w:r>
               <w:rPr>
-                <w:rFonts w:ascii="BRH Devanagari Extra" w:hAnsi="BRH Devanagari Extra" w:cs="BRH Devanagari Extra"/>
-                <w:color w:val="000000"/>
-                <w:sz w:val="32"/>
-                <w:szCs w:val="40"/>
+                <w:rFonts w:cs="Latha"/>
+                <w:b/>
+                <w:bCs/>
+                <w:szCs w:val="28"/>
+                <w:lang w:bidi="ta-IN"/>
               </w:rPr>
               <w:t>)</w:t>
             </w:r>
             <w:r>
               <w:rPr>
-                <w:rFonts w:ascii="BRH Devanagari Extra" w:hAnsi="BRH Devanagari Extra" w:cs="BRH Devanagari Extra"/>
-                <w:color w:val="000000"/>
-                <w:sz w:val="32"/>
-                <w:szCs w:val="40"/>
+                <w:rFonts w:ascii="Latha" w:hAnsi="Latha" w:cs="Latha"/>
+                <w:szCs w:val="28"/>
+                <w:lang w:bidi="ta-IN"/>
               </w:rPr>
               <w:tab/>
             </w:r>
             <w:r>
               <w:rPr>
-                <w:rFonts w:cs="BRH Devanagari Extra"/>
-                <w:color w:val="000000"/>
-                <w:szCs w:val="40"/>
+                <w:rFonts w:cs="Latha"/>
+                <w:b/>
+                <w:bCs/>
+                <w:szCs w:val="28"/>
+                <w:cs/>
+                <w:lang w:bidi="ta-IN"/>
+              </w:rPr>
+              <w:t>1.5</w:t>
+            </w:r>
+            <w:r>
+              <w:rPr>
+                <w:rFonts w:cs="Latha"/>
+                <w:b/>
+                <w:bCs/>
+                <w:szCs w:val="28"/>
+                <w:lang w:bidi="ta-IN"/>
+              </w:rPr>
+              <w:t>.2</w:t>
+            </w:r>
+            <w:r>
+              <w:rPr>
+                <w:rFonts w:ascii="Latha" w:hAnsi="Latha" w:cs="Latha"/>
+                <w:b/>
+                <w:bCs/>
+                <w:sz w:val="32"/>
+                <w:szCs w:val="32"/>
+                <w:lang w:bidi="ta-IN"/>
+              </w:rPr>
+              <w:t>.</w:t>
+            </w:r>
+            <w:r>
+              <w:rPr>
+                <w:rFonts w:cs="Latha"/>
+                <w:b/>
+                <w:bCs/>
+                <w:szCs w:val="28"/>
+                <w:cs/>
+                <w:lang w:bidi="ta-IN"/>
               </w:rPr>
               <w:t>1</w:t>
             </w:r>
             <w:r>
               <w:rPr>
-                <w:rFonts w:ascii="BRH Devanagari Extra" w:hAnsi="BRH Devanagari Extra" w:cs="BRH Devanagari Extra"/>
-                <w:color w:val="000000"/>
-                <w:sz w:val="32"/>
-                <w:szCs w:val="40"/>
-              </w:rPr>
-              <w:t>.</w:t>
-            </w:r>
-            <w:r>
-              <w:rPr>
-                <w:rFonts w:cs="BRH Devanagari Extra"/>
-                <w:color w:val="000000"/>
-                <w:szCs w:val="40"/>
+                <w:rFonts w:cs="Latha"/>
+                <w:b/>
+                <w:bCs/>
+                <w:szCs w:val="28"/>
+                <w:lang w:bidi="ta-IN"/>
+              </w:rPr>
+              <w:t>(</w:t>
+            </w:r>
+            <w:r>
+              <w:rPr>
+                <w:rFonts w:cs="Latha"/>
+                <w:b/>
+                <w:bCs/>
+                <w:szCs w:val="28"/>
+                <w:cs/>
+                <w:lang w:bidi="ta-IN"/>
               </w:rPr>
               <w:t>5</w:t>
             </w:r>
             <w:r>
               <w:rPr>
-                <w:rFonts w:ascii="BRH Devanagari Extra" w:hAnsi="BRH Devanagari Extra" w:cs="BRH Devanagari Extra"/>
-                <w:color w:val="000000"/>
-                <w:sz w:val="32"/>
-                <w:szCs w:val="40"/>
-              </w:rPr>
-              <w:t>.</w:t>
-            </w:r>
-            <w:r>
-              <w:rPr>
-                <w:rFonts w:cs="BRH Devanagari Extra"/>
-                <w:color w:val="000000"/>
-                <w:szCs w:val="40"/>
-              </w:rPr>
-              <w:t>2</w:t>
-            </w:r>
-            <w:r>
-              <w:rPr>
-                <w:rFonts w:ascii="BRH Devanagari Extra" w:hAnsi="BRH Devanagari Extra" w:cs="BRH Devanagari Extra"/>
-                <w:color w:val="000000"/>
-                <w:sz w:val="32"/>
-                <w:szCs w:val="40"/>
-              </w:rPr>
-              <w:t>.</w:t>
-            </w:r>
-            <w:r>
-              <w:rPr>
-                <w:rFonts w:cs="BRH Devanagari Extra"/>
-                <w:color w:val="000000"/>
-                <w:szCs w:val="40"/>
+                <w:rFonts w:cs="Latha"/>
+                <w:b/>
+                <w:bCs/>
+                <w:szCs w:val="28"/>
+                <w:lang w:bidi="ta-IN"/>
+              </w:rPr>
+              <w:t>0)</w:t>
+            </w:r>
+            <w:r>
+              <w:rPr>
+                <w:rFonts w:ascii="Latha" w:hAnsi="Latha" w:cs="Latha"/>
+                <w:szCs w:val="28"/>
+                <w:lang w:bidi="ta-IN"/>
+              </w:rPr>
+              <w:t xml:space="preserve">-  </w:t>
+            </w:r>
+            <w:r>
+              <w:rPr>
+                <w:rFonts w:ascii="Latha" w:hAnsi="Latha" w:cs="Latha"/>
+                <w:szCs w:val="28"/>
+                <w:cs/>
+                <w:lang w:bidi="ta-IN"/>
+              </w:rPr>
+              <w:t xml:space="preserve">ஆ </w:t>
+            </w:r>
+            <w:r>
+              <w:rPr>
+                <w:rFonts w:ascii="Latha" w:hAnsi="Latha" w:cs="Latha"/>
+                <w:szCs w:val="28"/>
+                <w:lang w:bidi="ta-IN"/>
+              </w:rPr>
+              <w:t xml:space="preserve">| </w:t>
+            </w:r>
+            <w:r>
+              <w:rPr>
+                <w:rFonts w:ascii="Latha" w:hAnsi="Latha" w:cs="Latha"/>
+                <w:szCs w:val="28"/>
+                <w:cs/>
+                <w:lang w:bidi="ta-IN"/>
+              </w:rPr>
+              <w:t>த</w:t>
+            </w:r>
+            <w:r>
+              <w:rPr>
+                <w:rFonts w:ascii="BRH Tamil Tab Extra" w:hAnsi="BRH Tamil Tab Extra" w:cs="Latha"/>
+                <w:b/>
+                <w:bCs/>
+                <w:sz w:val="32"/>
+                <w:szCs w:val="28"/>
+                <w:lang w:bidi="ta-IN"/>
+              </w:rPr>
+              <w:t>…</w:t>
+            </w:r>
+            <w:r>
+              <w:rPr>
+                <w:rFonts w:ascii="Latha" w:hAnsi="Latha" w:cs="Latha"/>
+                <w:b/>
+                <w:bCs/>
+                <w:position w:val="-12"/>
+                <w:szCs w:val="28"/>
+                <w:cs/>
+                <w:lang w:bidi="ta-IN"/>
+              </w:rPr>
+              <w:t>4</w:t>
+            </w:r>
+            <w:r>
+              <w:rPr>
+                <w:rFonts w:ascii="Latha" w:hAnsi="Latha" w:cs="Latha"/>
+                <w:szCs w:val="28"/>
+                <w:highlight w:val="yellow"/>
+                <w:cs/>
+                <w:lang w:bidi="ta-IN"/>
+              </w:rPr>
+              <w:t>த்தே</w:t>
+            </w:r>
+            <w:r>
+              <w:rPr>
+                <w:rFonts w:ascii="Latha" w:hAnsi="Latha" w:cs="Latha"/>
+                <w:szCs w:val="28"/>
+                <w:cs/>
+                <w:lang w:bidi="ta-IN"/>
+              </w:rPr>
+              <w:t xml:space="preserve"> </w:t>
+            </w:r>
+            <w:r>
+              <w:rPr>
+                <w:rFonts w:ascii="Latha" w:hAnsi="Latha" w:cs="Latha"/>
+                <w:szCs w:val="28"/>
+                <w:lang w:bidi="ta-IN"/>
+              </w:rPr>
+              <w:t>|</w:t>
+            </w:r>
+          </w:p>
+          <w:p>
+            <w:pPr>
+              <w:autoSpaceDE w:val="0"/>
+              <w:autoSpaceDN w:val="0"/>
+              <w:adjustRightInd w:val="0"/>
+              <w:rPr>
+                <w:rFonts w:ascii="Latha" w:hAnsi="Latha" w:cs="Latha"/>
+                <w:szCs w:val="28"/>
+                <w:lang w:bidi="ta-IN"/>
+              </w:rPr>
+            </w:pPr>
+            <w:r>
+              <w:rPr>
+                <w:rFonts w:ascii="Latha" w:hAnsi="Latha" w:cs="Latha"/>
+                <w:szCs w:val="28"/>
+                <w:cs/>
+                <w:lang w:bidi="ta-IN"/>
+              </w:rPr>
+              <w:t xml:space="preserve">ஆ </w:t>
+            </w:r>
+            <w:r>
+              <w:rPr>
+                <w:rFonts w:ascii="Latha" w:hAnsi="Latha" w:cs="Latha"/>
+                <w:szCs w:val="28"/>
+                <w:highlight w:val="yellow"/>
+                <w:cs/>
+                <w:lang w:bidi="ta-IN"/>
+              </w:rPr>
+              <w:t>த</w:t>
+            </w:r>
+            <w:r>
+              <w:rPr>
+                <w:rFonts w:ascii="BRH Tamil Tab Extra" w:hAnsi="BRH Tamil Tab Extra" w:cs="Latha"/>
+                <w:b/>
+                <w:bCs/>
+                <w:sz w:val="32"/>
+                <w:szCs w:val="28"/>
+                <w:highlight w:val="yellow"/>
+                <w:lang w:bidi="ta-IN"/>
+              </w:rPr>
+              <w:t>…</w:t>
+            </w:r>
+            <w:r>
+              <w:rPr>
+                <w:rFonts w:ascii="Latha" w:hAnsi="Latha" w:cs="Latha"/>
+                <w:b/>
+                <w:bCs/>
+                <w:position w:val="-12"/>
+                <w:szCs w:val="28"/>
+                <w:cs/>
+                <w:lang w:bidi="ta-IN"/>
+              </w:rPr>
+              <w:t>4</w:t>
+            </w:r>
+            <w:r>
+              <w:rPr>
+                <w:rFonts w:ascii="Latha" w:hAnsi="Latha" w:cs="Latha"/>
+                <w:szCs w:val="28"/>
+                <w:cs/>
+                <w:lang w:bidi="ta-IN"/>
+              </w:rPr>
+              <w:t xml:space="preserve">த்தே </w:t>
+            </w:r>
+            <w:r>
+              <w:rPr>
+                <w:rFonts w:ascii="Latha" w:hAnsi="Latha" w:cs="Latha"/>
+                <w:szCs w:val="28"/>
+                <w:highlight w:val="yellow"/>
+                <w:cs/>
+                <w:lang w:bidi="ta-IN"/>
+              </w:rPr>
+              <w:t>த</w:t>
+            </w:r>
+            <w:r>
+              <w:rPr>
+                <w:rFonts w:ascii="BRH Tamil Tab Extra" w:hAnsi="BRH Tamil Tab Extra" w:cs="Latha"/>
+                <w:b/>
+                <w:bCs/>
+                <w:sz w:val="32"/>
+                <w:szCs w:val="28"/>
+                <w:lang w:bidi="ta-IN"/>
+              </w:rPr>
+              <w:t>…</w:t>
+            </w:r>
+            <w:r>
+              <w:rPr>
+                <w:rFonts w:ascii="Latha" w:hAnsi="Latha" w:cs="Latha"/>
+                <w:b/>
+                <w:bCs/>
+                <w:position w:val="-12"/>
+                <w:szCs w:val="28"/>
+                <w:highlight w:val="yellow"/>
+                <w:cs/>
+                <w:lang w:bidi="ta-IN"/>
+              </w:rPr>
+              <w:t>4</w:t>
+            </w:r>
+            <w:r>
+              <w:rPr>
+                <w:rFonts w:ascii="Latha" w:hAnsi="Latha" w:cs="Latha"/>
+                <w:szCs w:val="28"/>
+                <w:highlight w:val="yellow"/>
+                <w:cs/>
+                <w:lang w:bidi="ta-IN"/>
+              </w:rPr>
+              <w:t>த்த</w:t>
+            </w:r>
+            <w:r>
+              <w:rPr>
+                <w:rFonts w:ascii="Latha" w:hAnsi="Latha" w:cs="Latha"/>
+                <w:szCs w:val="28"/>
+                <w:cs/>
+                <w:lang w:bidi="ta-IN"/>
+              </w:rPr>
+              <w:t xml:space="preserve"> ஆ </w:t>
+            </w:r>
+            <w:r>
+              <w:rPr>
+                <w:rFonts w:ascii="Latha" w:hAnsi="Latha" w:cs="Latha"/>
+                <w:szCs w:val="28"/>
+                <w:highlight w:val="yellow"/>
+                <w:cs/>
+                <w:lang w:bidi="ta-IN"/>
+              </w:rPr>
+              <w:t>த</w:t>
+            </w:r>
+            <w:r>
+              <w:rPr>
+                <w:rFonts w:ascii="BRH Tamil Tab Extra" w:hAnsi="BRH Tamil Tab Extra" w:cs="Latha"/>
+                <w:b/>
+                <w:bCs/>
+                <w:sz w:val="32"/>
+                <w:szCs w:val="28"/>
+                <w:lang w:bidi="ta-IN"/>
+              </w:rPr>
+              <w:t>…</w:t>
+            </w:r>
+            <w:r>
+              <w:rPr>
+                <w:rFonts w:ascii="Latha" w:hAnsi="Latha" w:cs="Latha"/>
+                <w:b/>
+                <w:bCs/>
+                <w:position w:val="-12"/>
+                <w:szCs w:val="28"/>
+                <w:cs/>
+                <w:lang w:bidi="ta-IN"/>
+              </w:rPr>
+              <w:t>4</w:t>
+            </w:r>
+            <w:r>
+              <w:rPr>
+                <w:rFonts w:ascii="Latha" w:hAnsi="Latha" w:cs="Latha"/>
+                <w:szCs w:val="28"/>
+                <w:cs/>
+                <w:lang w:bidi="ta-IN"/>
+              </w:rPr>
+              <w:t xml:space="preserve">த்தே </w:t>
+            </w:r>
+            <w:r>
+              <w:rPr>
+                <w:rFonts w:ascii="Latha" w:hAnsi="Latha" w:cs="Latha"/>
+                <w:szCs w:val="28"/>
+                <w:lang w:bidi="ta-IN"/>
+              </w:rPr>
+              <w:t xml:space="preserve">| </w:t>
+            </w:r>
+          </w:p>
+          <w:p>
+            <w:pPr>
+              <w:autoSpaceDE w:val="0"/>
+              <w:autoSpaceDN w:val="0"/>
+              <w:adjustRightInd w:val="0"/>
+              <w:rPr>
+                <w:rFonts w:ascii="Latha" w:hAnsi="Latha" w:cs="Latha"/>
+                <w:szCs w:val="28"/>
+                <w:lang w:bidi="ta-IN"/>
+              </w:rPr>
+            </w:pPr>
+            <w:r>
+              <w:rPr>
+                <w:rFonts w:cs="Latha"/>
+                <w:b/>
+                <w:bCs/>
+                <w:szCs w:val="28"/>
+                <w:cs/>
+                <w:lang w:bidi="ta-IN"/>
               </w:rPr>
               <w:t>1</w:t>
             </w:r>
             <w:r>
               <w:rPr>
-                <w:rFonts w:ascii="BRH Devanagari Extra" w:hAnsi="BRH Devanagari Extra" w:cs="BRH Devanagari Extra"/>
-                <w:color w:val="000000"/>
-                <w:sz w:val="32"/>
-                <w:szCs w:val="40"/>
-              </w:rPr>
-              <w:t>(</w:t>
-            </w:r>
-            <w:r>
-              <w:rPr>
-                <w:rFonts w:cs="BRH Devanagari Extra"/>
-                <w:color w:val="000000"/>
-                <w:szCs w:val="40"/>
-              </w:rPr>
-              <w:t>50</w:t>
-            </w:r>
-            <w:r>
-              <w:rPr>
-                <w:rFonts w:ascii="BRH Devanagari Extra" w:hAnsi="BRH Devanagari Extra" w:cs="BRH Devanagari Extra"/>
-                <w:color w:val="000000"/>
-                <w:sz w:val="32"/>
-                <w:szCs w:val="40"/>
+                <w:rFonts w:cs="Latha"/>
+                <w:b/>
+                <w:bCs/>
+                <w:szCs w:val="28"/>
+                <w:lang w:bidi="ta-IN"/>
               </w:rPr>
               <w:t>)</w:t>
             </w:r>
-            <w:proofErr w:type="gramStart"/>
-            <w:r>
-              <w:rPr>
-                <w:rFonts w:ascii="BRH Devanagari Extra" w:hAnsi="BRH Devanagari Extra" w:cs="BRH Devanagari Extra"/>
-                <w:color w:val="000000"/>
-                <w:sz w:val="32"/>
-                <w:szCs w:val="40"/>
-              </w:rPr>
-              <w:t>-  AÉ</w:t>
-            </w:r>
-            <w:proofErr w:type="gramEnd"/>
-            <w:r>
-              <w:rPr>
-                <w:rFonts w:ascii="BRH Devanagari Extra" w:hAnsi="BRH Devanagari Extra" w:cs="BRH Devanagari Extra"/>
-                <w:color w:val="000000"/>
-                <w:sz w:val="32"/>
-                <w:szCs w:val="40"/>
-              </w:rPr>
-              <w:t xml:space="preserve"> | kÉ</w:t>
-            </w:r>
-            <w:r>
-              <w:rPr>
-                <w:rFonts w:ascii="BRH Malayalam Extra" w:hAnsi="BRH Malayalam Extra" w:cs="BRH Devanagari Extra"/>
-                <w:color w:val="000000"/>
-                <w:szCs w:val="40"/>
-                <w:highlight w:val="yellow"/>
-              </w:rPr>
-              <w:t>–</w:t>
-            </w:r>
-            <w:r>
-              <w:rPr>
-                <w:rFonts w:ascii="BRH Devanagari Extra" w:hAnsi="BRH Devanagari Extra" w:cs="BRH Devanagari Extra"/>
-                <w:color w:val="000000"/>
-                <w:sz w:val="32"/>
-                <w:szCs w:val="40"/>
-                <w:highlight w:val="yellow"/>
-              </w:rPr>
-              <w:t>¨Éå</w:t>
-            </w:r>
-            <w:r>
-              <w:rPr>
-                <w:rFonts w:ascii="BRH Devanagari Extra" w:hAnsi="BRH Devanagari Extra" w:cs="BRH Devanagari Extra"/>
-                <w:color w:val="000000"/>
-                <w:sz w:val="32"/>
-                <w:szCs w:val="40"/>
-              </w:rPr>
-              <w:t xml:space="preserve"> |</w:t>
+            <w:r>
+              <w:rPr>
+                <w:rFonts w:ascii="Latha" w:hAnsi="Latha" w:cs="Latha"/>
+                <w:szCs w:val="28"/>
+                <w:lang w:bidi="ta-IN"/>
+              </w:rPr>
+              <w:tab/>
+            </w:r>
+            <w:r>
+              <w:rPr>
+                <w:rFonts w:cs="Latha"/>
+                <w:b/>
+                <w:bCs/>
+                <w:szCs w:val="28"/>
+                <w:cs/>
+                <w:lang w:bidi="ta-IN"/>
+              </w:rPr>
+              <w:t>1.5</w:t>
+            </w:r>
+            <w:r>
+              <w:rPr>
+                <w:rFonts w:cs="Latha"/>
+                <w:b/>
+                <w:bCs/>
+                <w:szCs w:val="28"/>
+                <w:lang w:bidi="ta-IN"/>
+              </w:rPr>
+              <w:t>.2.2(</w:t>
+            </w:r>
+            <w:r>
+              <w:rPr>
+                <w:rFonts w:cs="Latha"/>
+                <w:b/>
+                <w:bCs/>
+                <w:szCs w:val="28"/>
+                <w:cs/>
+                <w:lang w:bidi="ta-IN"/>
+              </w:rPr>
+              <w:t>1</w:t>
+            </w:r>
+            <w:r>
+              <w:rPr>
+                <w:rFonts w:cs="Latha"/>
+                <w:b/>
+                <w:bCs/>
+                <w:szCs w:val="28"/>
+                <w:lang w:bidi="ta-IN"/>
+              </w:rPr>
+              <w:t>)</w:t>
+            </w:r>
+            <w:r>
+              <w:rPr>
+                <w:rFonts w:ascii="Latha" w:hAnsi="Latha" w:cs="Latha"/>
+                <w:szCs w:val="28"/>
+                <w:lang w:bidi="ta-IN"/>
+              </w:rPr>
+              <w:t xml:space="preserve">-  </w:t>
+            </w:r>
+            <w:r>
+              <w:rPr>
+                <w:rFonts w:ascii="Latha" w:hAnsi="Latha" w:cs="Latha"/>
+                <w:szCs w:val="28"/>
+                <w:cs/>
+                <w:lang w:bidi="ta-IN"/>
+              </w:rPr>
+              <w:t>த</w:t>
+            </w:r>
+            <w:r>
+              <w:rPr>
+                <w:rFonts w:ascii="BRH Tamil Tab Extra" w:hAnsi="BRH Tamil Tab Extra" w:cs="Latha"/>
+                <w:b/>
+                <w:bCs/>
+                <w:sz w:val="32"/>
+                <w:szCs w:val="28"/>
+                <w:lang w:bidi="ta-IN"/>
+              </w:rPr>
+              <w:t>…</w:t>
+            </w:r>
+            <w:r>
+              <w:rPr>
+                <w:rFonts w:ascii="Latha" w:hAnsi="Latha" w:cs="Latha"/>
+                <w:b/>
+                <w:bCs/>
+                <w:position w:val="-12"/>
+                <w:szCs w:val="28"/>
+                <w:cs/>
+                <w:lang w:bidi="ta-IN"/>
+              </w:rPr>
+              <w:t>4</w:t>
+            </w:r>
+            <w:r>
+              <w:rPr>
+                <w:rFonts w:ascii="Latha" w:hAnsi="Latha" w:cs="Latha"/>
+                <w:szCs w:val="28"/>
+                <w:cs/>
+                <w:lang w:bidi="ta-IN"/>
+              </w:rPr>
+              <w:t xml:space="preserve">த்தே </w:t>
+            </w:r>
+            <w:r>
+              <w:rPr>
+                <w:rFonts w:ascii="Latha" w:hAnsi="Latha" w:cs="Latha"/>
+                <w:szCs w:val="28"/>
+                <w:lang w:bidi="ta-IN"/>
+              </w:rPr>
+              <w:t xml:space="preserve">| </w:t>
+            </w:r>
+            <w:r>
+              <w:rPr>
+                <w:rFonts w:ascii="Latha" w:hAnsi="Latha" w:cs="Latha"/>
+                <w:szCs w:val="28"/>
+                <w:cs/>
+                <w:lang w:bidi="ta-IN"/>
+              </w:rPr>
+              <w:t>ஶ</w:t>
+            </w:r>
+            <w:r>
+              <w:rPr>
+                <w:rFonts w:ascii="BRH Tamil Tab Extra" w:hAnsi="BRH Tamil Tab Extra" w:cs="Latha"/>
+                <w:b/>
+                <w:bCs/>
+                <w:sz w:val="32"/>
+                <w:szCs w:val="28"/>
+                <w:lang w:bidi="ta-IN"/>
+              </w:rPr>
+              <w:t>…</w:t>
+            </w:r>
+            <w:r>
+              <w:rPr>
+                <w:rFonts w:ascii="Latha" w:hAnsi="Latha" w:cs="Latha"/>
+                <w:szCs w:val="28"/>
+                <w:cs/>
+                <w:lang w:bidi="ta-IN"/>
+              </w:rPr>
+              <w:t>தாக்ஷ</w:t>
+            </w:r>
+            <w:r>
+              <w:rPr>
+                <w:rFonts w:ascii="BRH Tamil Tab Extra" w:hAnsi="BRH Tamil Tab Extra" w:cs="Latha"/>
+                <w:b/>
+                <w:bCs/>
+                <w:sz w:val="32"/>
+                <w:szCs w:val="28"/>
+                <w:lang w:bidi="ta-IN"/>
+              </w:rPr>
+              <w:t>†</w:t>
+            </w:r>
+            <w:r>
+              <w:rPr>
+                <w:rFonts w:ascii="Latha" w:hAnsi="Latha" w:cs="Latha"/>
+                <w:szCs w:val="28"/>
+                <w:cs/>
+                <w:lang w:bidi="ta-IN"/>
+              </w:rPr>
+              <w:t>ரா</w:t>
+            </w:r>
+            <w:r>
+              <w:rPr>
+                <w:rFonts w:cs="Latha"/>
+                <w:b/>
+                <w:bCs/>
+                <w:szCs w:val="28"/>
+                <w:cs/>
+                <w:lang w:bidi="ta-IN"/>
+              </w:rPr>
+              <w:t>:</w:t>
+            </w:r>
+            <w:r>
+              <w:rPr>
+                <w:rFonts w:ascii="Latha" w:hAnsi="Latha" w:cs="Latha"/>
+                <w:szCs w:val="28"/>
+                <w:cs/>
+                <w:lang w:bidi="ta-IN"/>
+              </w:rPr>
+              <w:t xml:space="preserve"> </w:t>
+            </w:r>
+            <w:r>
+              <w:rPr>
+                <w:rFonts w:ascii="Latha" w:hAnsi="Latha" w:cs="Latha"/>
+                <w:szCs w:val="28"/>
+                <w:lang w:bidi="ta-IN"/>
+              </w:rPr>
+              <w:t>|</w:t>
             </w:r>
           </w:p>
           <w:p>
@@ -343,453 +750,310 @@
             </w:pPr>
             <w:r>
               <w:rPr>
-                <w:rFonts w:ascii="BRH Devanagari Extra" w:hAnsi="BRH Devanagari Extra" w:cs="BRH Devanagari Extra"/>
-                <w:color w:val="000000"/>
-                <w:sz w:val="32"/>
-                <w:szCs w:val="40"/>
-              </w:rPr>
-              <w:t xml:space="preserve">AÉ </w:t>
-            </w:r>
-            <w:r>
-              <w:rPr>
-                <w:rFonts w:ascii="BRH Devanagari Extra" w:hAnsi="BRH Devanagari Extra" w:cs="BRH Devanagari Extra"/>
-                <w:color w:val="000000"/>
-                <w:sz w:val="32"/>
-                <w:szCs w:val="40"/>
+                <w:rFonts w:ascii="Latha" w:hAnsi="Latha" w:cs="Latha"/>
+                <w:szCs w:val="28"/>
+                <w:cs/>
+                <w:lang w:bidi="ta-IN"/>
+              </w:rPr>
+              <w:t>த</w:t>
+            </w:r>
+            <w:r>
+              <w:rPr>
+                <w:rFonts w:ascii="BRH Tamil Tab Extra" w:hAnsi="BRH Tamil Tab Extra" w:cs="Latha"/>
+                <w:b/>
+                <w:bCs/>
+                <w:sz w:val="32"/>
+                <w:szCs w:val="28"/>
+                <w:lang w:bidi="ta-IN"/>
+              </w:rPr>
+              <w:t>…</w:t>
+            </w:r>
+            <w:r>
+              <w:rPr>
+                <w:rFonts w:ascii="Latha" w:hAnsi="Latha" w:cs="Latha"/>
+                <w:b/>
+                <w:bCs/>
+                <w:position w:val="-12"/>
+                <w:szCs w:val="28"/>
+                <w:cs/>
+                <w:lang w:bidi="ta-IN"/>
+              </w:rPr>
+              <w:t>4</w:t>
+            </w:r>
+            <w:r>
+              <w:rPr>
+                <w:rFonts w:ascii="Latha" w:hAnsi="Latha" w:cs="Latha"/>
+                <w:szCs w:val="28"/>
                 <w:highlight w:val="yellow"/>
-              </w:rPr>
-              <w:t>kÉ</w:t>
-            </w:r>
-            <w:r>
-              <w:rPr>
-                <w:rFonts w:ascii="BRH Malayalam Extra" w:hAnsi="BRH Malayalam Extra" w:cs="BRH Devanagari Extra"/>
-                <w:color w:val="000000"/>
-                <w:szCs w:val="40"/>
-              </w:rPr>
-              <w:t>–</w:t>
-            </w:r>
-            <w:r>
-              <w:rPr>
-                <w:rFonts w:ascii="BRH Devanagari Extra" w:hAnsi="BRH Devanagari Extra" w:cs="BRH Devanagari Extra"/>
-                <w:color w:val="000000"/>
-                <w:sz w:val="32"/>
-                <w:szCs w:val="40"/>
-              </w:rPr>
-              <w:t xml:space="preserve">¨Éå </w:t>
-            </w:r>
-            <w:r>
-              <w:rPr>
-                <w:rFonts w:ascii="BRH Devanagari Extra" w:hAnsi="BRH Devanagari Extra" w:cs="BRH Devanagari Extra"/>
-                <w:color w:val="000000"/>
-                <w:sz w:val="32"/>
-                <w:szCs w:val="40"/>
+                <w:cs/>
+                <w:lang w:bidi="ta-IN"/>
+              </w:rPr>
+              <w:t>த்தே</w:t>
+            </w:r>
+            <w:r>
+              <w:rPr>
+                <w:rFonts w:ascii="Latha" w:hAnsi="Latha" w:cs="Latha"/>
+                <w:szCs w:val="28"/>
+                <w:cs/>
+                <w:lang w:bidi="ta-IN"/>
+              </w:rPr>
+              <w:t xml:space="preserve"> ஶ</w:t>
+            </w:r>
+            <w:r>
+              <w:rPr>
+                <w:rFonts w:ascii="BRH Tamil Tab Extra" w:hAnsi="BRH Tamil Tab Extra" w:cs="Latha"/>
+                <w:b/>
+                <w:bCs/>
+                <w:sz w:val="32"/>
+                <w:szCs w:val="28"/>
+                <w:lang w:bidi="ta-IN"/>
+              </w:rPr>
+              <w:t>…</w:t>
+            </w:r>
+            <w:r>
+              <w:rPr>
+                <w:rFonts w:ascii="Latha" w:hAnsi="Latha" w:cs="Latha"/>
+                <w:szCs w:val="28"/>
+                <w:cs/>
+                <w:lang w:bidi="ta-IN"/>
+              </w:rPr>
+              <w:t>தாக்ஷ</w:t>
+            </w:r>
+            <w:r>
+              <w:rPr>
+                <w:rFonts w:ascii="BRH Tamil Tab Extra" w:hAnsi="BRH Tamil Tab Extra" w:cs="Latha"/>
+                <w:b/>
+                <w:bCs/>
+                <w:sz w:val="32"/>
+                <w:szCs w:val="28"/>
+                <w:lang w:bidi="ta-IN"/>
+              </w:rPr>
+              <w:t>†</w:t>
+            </w:r>
+            <w:r>
+              <w:rPr>
+                <w:rFonts w:ascii="Latha" w:hAnsi="Latha" w:cs="Latha"/>
+                <w:szCs w:val="28"/>
+                <w:cs/>
+                <w:lang w:bidi="ta-IN"/>
+              </w:rPr>
+              <w:t>ரா</w:t>
+            </w:r>
+            <w:r>
+              <w:rPr>
+                <w:rFonts w:cs="Latha"/>
+                <w:b/>
+                <w:bCs/>
+                <w:szCs w:val="28"/>
+                <w:cs/>
+                <w:lang w:bidi="ta-IN"/>
+              </w:rPr>
+              <w:t>:</w:t>
+            </w:r>
+            <w:r>
+              <w:rPr>
+                <w:rFonts w:ascii="Latha" w:hAnsi="Latha" w:cs="Latha"/>
+                <w:szCs w:val="28"/>
+                <w:cs/>
+                <w:lang w:bidi="ta-IN"/>
+              </w:rPr>
+              <w:t xml:space="preserve"> ஶ</w:t>
+            </w:r>
+            <w:r>
+              <w:rPr>
+                <w:rFonts w:ascii="BRH Tamil Tab Extra" w:hAnsi="BRH Tamil Tab Extra" w:cs="Latha"/>
+                <w:b/>
+                <w:bCs/>
+                <w:sz w:val="32"/>
+                <w:szCs w:val="28"/>
+                <w:lang w:bidi="ta-IN"/>
+              </w:rPr>
+              <w:t>…</w:t>
+            </w:r>
+            <w:r>
+              <w:rPr>
+                <w:rFonts w:ascii="Latha" w:hAnsi="Latha" w:cs="Latha"/>
+                <w:szCs w:val="28"/>
+                <w:cs/>
+                <w:lang w:bidi="ta-IN"/>
+              </w:rPr>
+              <w:t>தாக்ஷ</w:t>
+            </w:r>
+            <w:r>
+              <w:rPr>
+                <w:rFonts w:ascii="BRH Tamil Tab Extra" w:hAnsi="BRH Tamil Tab Extra" w:cs="Latha"/>
+                <w:b/>
+                <w:bCs/>
+                <w:sz w:val="32"/>
+                <w:szCs w:val="28"/>
+                <w:lang w:bidi="ta-IN"/>
+              </w:rPr>
+              <w:t>†</w:t>
+            </w:r>
+            <w:r>
+              <w:rPr>
+                <w:rFonts w:ascii="Latha" w:hAnsi="Latha" w:cs="Latha"/>
+                <w:szCs w:val="28"/>
+                <w:cs/>
+                <w:lang w:bidi="ta-IN"/>
+              </w:rPr>
+              <w:t xml:space="preserve">ரா </w:t>
+            </w:r>
+            <w:r>
+              <w:rPr>
+                <w:rFonts w:ascii="Latha" w:hAnsi="Latha" w:cs="Latha"/>
+                <w:szCs w:val="28"/>
                 <w:highlight w:val="yellow"/>
-              </w:rPr>
-              <w:t>kÉ</w:t>
-            </w:r>
-            <w:r>
-              <w:rPr>
-                <w:rFonts w:ascii="BRH Malayalam Extra" w:hAnsi="BRH Malayalam Extra" w:cs="BRH Devanagari Extra"/>
-                <w:color w:val="000000"/>
-                <w:szCs w:val="40"/>
+                <w:cs/>
+                <w:lang w:bidi="ta-IN"/>
+              </w:rPr>
+              <w:t>த</w:t>
+            </w:r>
+            <w:r>
+              <w:rPr>
+                <w:rFonts w:ascii="BRH Tamil Tab Extra" w:hAnsi="BRH Tamil Tab Extra" w:cs="Latha"/>
+                <w:b/>
+                <w:bCs/>
+                <w:sz w:val="32"/>
+                <w:szCs w:val="28"/>
                 <w:highlight w:val="yellow"/>
-              </w:rPr>
-              <w:t>–</w:t>
-            </w:r>
-            <w:r>
-              <w:rPr>
-                <w:rFonts w:ascii="BRH Devanagari Extra" w:hAnsi="BRH Devanagari Extra" w:cs="BRH Devanagari Extra"/>
-                <w:color w:val="000000"/>
-                <w:sz w:val="32"/>
-                <w:szCs w:val="40"/>
+                <w:lang w:bidi="ta-IN"/>
+              </w:rPr>
+              <w:t>…</w:t>
+            </w:r>
+            <w:r>
+              <w:rPr>
+                <w:rFonts w:ascii="Latha" w:hAnsi="Latha" w:cs="Latha"/>
+                <w:b/>
+                <w:bCs/>
+                <w:position w:val="-12"/>
+                <w:szCs w:val="28"/>
                 <w:highlight w:val="yellow"/>
-              </w:rPr>
-              <w:t>¨É</w:t>
-            </w:r>
-            <w:r>
-              <w:rPr>
-                <w:rFonts w:ascii="BRH Devanagari Extra" w:hAnsi="BRH Devanagari Extra" w:cs="BRH Devanagari Extra"/>
-                <w:color w:val="000000"/>
-                <w:sz w:val="32"/>
-                <w:szCs w:val="40"/>
-              </w:rPr>
-              <w:t xml:space="preserve"> AÉ </w:t>
-            </w:r>
-            <w:r>
-              <w:rPr>
-                <w:rFonts w:ascii="BRH Devanagari Extra" w:hAnsi="BRH Devanagari Extra" w:cs="BRH Devanagari Extra"/>
-                <w:color w:val="000000"/>
-                <w:sz w:val="32"/>
-                <w:szCs w:val="40"/>
+                <w:cs/>
+                <w:lang w:bidi="ta-IN"/>
+              </w:rPr>
+              <w:t>4</w:t>
+            </w:r>
+            <w:r>
+              <w:rPr>
+                <w:rFonts w:ascii="Latha" w:hAnsi="Latha" w:cs="Latha"/>
+                <w:szCs w:val="28"/>
+                <w:cs/>
+                <w:lang w:bidi="ta-IN"/>
+              </w:rPr>
+              <w:t xml:space="preserve">த்தே </w:t>
+            </w:r>
+            <w:r>
+              <w:rPr>
+                <w:rFonts w:ascii="Latha" w:hAnsi="Latha" w:cs="Latha"/>
+                <w:szCs w:val="28"/>
                 <w:highlight w:val="yellow"/>
-              </w:rPr>
-              <w:t>k</w:t>
-            </w:r>
-            <w:r>
-              <w:rPr>
-                <w:rFonts w:ascii="BRH Devanagari Extra" w:hAnsi="BRH Devanagari Extra" w:cs="BRH Devanagari Extra"/>
-                <w:color w:val="000000"/>
-                <w:sz w:val="32"/>
-                <w:szCs w:val="40"/>
-              </w:rPr>
-              <w:t>É</w:t>
-            </w:r>
-            <w:r>
-              <w:rPr>
-                <w:rFonts w:ascii="BRH Malayalam Extra" w:hAnsi="BRH Malayalam Extra" w:cs="BRH Devanagari Extra"/>
-                <w:color w:val="000000"/>
-                <w:szCs w:val="40"/>
-              </w:rPr>
-              <w:t>–</w:t>
-            </w:r>
-            <w:r>
-              <w:rPr>
-                <w:rFonts w:ascii="BRH Devanagari Extra" w:hAnsi="BRH Devanagari Extra" w:cs="BRH Devanagari Extra"/>
-                <w:color w:val="000000"/>
-                <w:sz w:val="32"/>
-                <w:szCs w:val="40"/>
-              </w:rPr>
-              <w:t xml:space="preserve">¨Éå | </w:t>
-            </w:r>
-          </w:p>
-          <w:p>
-            <w:pPr>
-              <w:widowControl w:val="0"/>
-              <w:autoSpaceDE w:val="0"/>
-              <w:autoSpaceDN w:val="0"/>
-              <w:adjustRightInd w:val="0"/>
-              <w:spacing w:before="0" w:line="240" w:lineRule="auto"/>
-              <w:rPr>
-                <w:rFonts w:ascii="BRH Devanagari Extra" w:hAnsi="BRH Devanagari Extra" w:cs="BRH Devanagari Extra"/>
-                <w:color w:val="000000"/>
-                <w:sz w:val="32"/>
-                <w:szCs w:val="40"/>
-              </w:rPr>
-            </w:pPr>
-            <w:r>
-              <w:rPr>
-                <w:rFonts w:cs="BRH Devanagari Extra"/>
-                <w:color w:val="000000"/>
-                <w:szCs w:val="40"/>
-              </w:rPr>
-              <w:t>1</w:t>
-            </w:r>
-            <w:r>
-              <w:rPr>
-                <w:rFonts w:ascii="BRH Devanagari Extra" w:hAnsi="BRH Devanagari Extra" w:cs="BRH Devanagari Extra"/>
-                <w:color w:val="000000"/>
-                <w:sz w:val="32"/>
-                <w:szCs w:val="40"/>
-              </w:rPr>
-              <w:t>)</w:t>
-            </w:r>
-            <w:r>
-              <w:rPr>
-                <w:rFonts w:ascii="BRH Devanagari Extra" w:hAnsi="BRH Devanagari Extra" w:cs="BRH Devanagari Extra"/>
-                <w:color w:val="000000"/>
-                <w:sz w:val="32"/>
-                <w:szCs w:val="40"/>
-              </w:rPr>
-              <w:tab/>
-            </w:r>
-            <w:r>
-              <w:rPr>
-                <w:rFonts w:cs="BRH Devanagari Extra"/>
-                <w:color w:val="000000"/>
-                <w:szCs w:val="40"/>
-              </w:rPr>
-              <w:t>1</w:t>
-            </w:r>
-            <w:r>
-              <w:rPr>
-                <w:rFonts w:ascii="BRH Devanagari Extra" w:hAnsi="BRH Devanagari Extra" w:cs="BRH Devanagari Extra"/>
-                <w:color w:val="000000"/>
-                <w:sz w:val="32"/>
-                <w:szCs w:val="40"/>
-              </w:rPr>
-              <w:t>.</w:t>
-            </w:r>
-            <w:r>
-              <w:rPr>
-                <w:rFonts w:cs="BRH Devanagari Extra"/>
-                <w:color w:val="000000"/>
-                <w:szCs w:val="40"/>
-              </w:rPr>
-              <w:t>5</w:t>
-            </w:r>
-            <w:r>
-              <w:rPr>
-                <w:rFonts w:ascii="BRH Devanagari Extra" w:hAnsi="BRH Devanagari Extra" w:cs="BRH Devanagari Extra"/>
-                <w:color w:val="000000"/>
-                <w:sz w:val="32"/>
-                <w:szCs w:val="40"/>
-              </w:rPr>
-              <w:t>.</w:t>
-            </w:r>
-            <w:r>
-              <w:rPr>
-                <w:rFonts w:cs="BRH Devanagari Extra"/>
-                <w:color w:val="000000"/>
-                <w:szCs w:val="40"/>
-              </w:rPr>
-              <w:t>2</w:t>
-            </w:r>
-            <w:r>
-              <w:rPr>
-                <w:rFonts w:ascii="BRH Devanagari Extra" w:hAnsi="BRH Devanagari Extra" w:cs="BRH Devanagari Extra"/>
-                <w:color w:val="000000"/>
-                <w:sz w:val="32"/>
-                <w:szCs w:val="40"/>
-              </w:rPr>
-              <w:t>.</w:t>
-            </w:r>
-            <w:r>
-              <w:rPr>
-                <w:rFonts w:cs="BRH Devanagari Extra"/>
-                <w:color w:val="000000"/>
-                <w:szCs w:val="40"/>
-              </w:rPr>
-              <w:t>2</w:t>
-            </w:r>
-            <w:r>
-              <w:rPr>
-                <w:rFonts w:ascii="BRH Devanagari Extra" w:hAnsi="BRH Devanagari Extra" w:cs="BRH Devanagari Extra"/>
-                <w:color w:val="000000"/>
-                <w:sz w:val="32"/>
-                <w:szCs w:val="40"/>
-              </w:rPr>
-              <w:t>(</w:t>
-            </w:r>
-            <w:r>
-              <w:rPr>
-                <w:rFonts w:cs="BRH Devanagari Extra"/>
-                <w:color w:val="000000"/>
-                <w:szCs w:val="40"/>
-              </w:rPr>
-              <w:t>1</w:t>
-            </w:r>
-            <w:r>
-              <w:rPr>
-                <w:rFonts w:ascii="BRH Devanagari Extra" w:hAnsi="BRH Devanagari Extra" w:cs="BRH Devanagari Extra"/>
-                <w:color w:val="000000"/>
-                <w:sz w:val="32"/>
-                <w:szCs w:val="40"/>
-              </w:rPr>
-              <w:t>)</w:t>
-            </w:r>
-            <w:proofErr w:type="gramStart"/>
-            <w:r>
-              <w:rPr>
-                <w:rFonts w:ascii="BRH Devanagari Extra" w:hAnsi="BRH Devanagari Extra" w:cs="BRH Devanagari Extra"/>
-                <w:color w:val="000000"/>
-                <w:sz w:val="32"/>
-                <w:szCs w:val="40"/>
-              </w:rPr>
-              <w:t>-  kÉ</w:t>
-            </w:r>
-            <w:proofErr w:type="gramEnd"/>
-            <w:r>
-              <w:rPr>
-                <w:rFonts w:ascii="BRH Malayalam Extra" w:hAnsi="BRH Malayalam Extra" w:cs="BRH Devanagari Extra"/>
-                <w:color w:val="000000"/>
-                <w:szCs w:val="40"/>
+                <w:cs/>
+                <w:lang w:bidi="ta-IN"/>
+              </w:rPr>
+              <w:t>த</w:t>
+            </w:r>
+            <w:r>
+              <w:rPr>
+                <w:rFonts w:ascii="BRH Tamil Tab Extra" w:hAnsi="BRH Tamil Tab Extra" w:cs="Latha"/>
+                <w:b/>
+                <w:bCs/>
+                <w:sz w:val="32"/>
+                <w:szCs w:val="28"/>
                 <w:highlight w:val="yellow"/>
-              </w:rPr>
-              <w:t>–</w:t>
-            </w:r>
-            <w:r>
-              <w:rPr>
-                <w:rFonts w:ascii="BRH Devanagari Extra" w:hAnsi="BRH Devanagari Extra" w:cs="BRH Devanagari Extra"/>
-                <w:color w:val="000000"/>
-                <w:sz w:val="32"/>
-                <w:szCs w:val="40"/>
+                <w:lang w:bidi="ta-IN"/>
+              </w:rPr>
+              <w:t>…</w:t>
+            </w:r>
+            <w:r>
+              <w:rPr>
+                <w:rFonts w:ascii="Latha" w:hAnsi="Latha" w:cs="Latha"/>
+                <w:b/>
+                <w:bCs/>
+                <w:position w:val="-12"/>
+                <w:szCs w:val="28"/>
                 <w:highlight w:val="yellow"/>
-              </w:rPr>
-              <w:t>¨É</w:t>
-            </w:r>
-            <w:r>
-              <w:rPr>
-                <w:rFonts w:ascii="BRH Devanagari Extra" w:hAnsi="BRH Devanagari Extra" w:cs="BRH Devanagari Extra"/>
-                <w:color w:val="000000"/>
-                <w:sz w:val="32"/>
-                <w:szCs w:val="40"/>
-              </w:rPr>
-              <w:t>å | zÉ</w:t>
-            </w:r>
-            <w:r>
-              <w:rPr>
-                <w:rFonts w:ascii="BRH Malayalam Extra" w:hAnsi="BRH Malayalam Extra" w:cs="BRH Devanagari Extra"/>
-                <w:color w:val="000000"/>
-                <w:szCs w:val="40"/>
-              </w:rPr>
-              <w:t>–</w:t>
-            </w:r>
-            <w:r>
-              <w:rPr>
-                <w:rFonts w:ascii="BRH Devanagari Extra" w:hAnsi="BRH Devanagari Extra" w:cs="BRH Devanagari Extra"/>
-                <w:color w:val="000000"/>
-                <w:sz w:val="32"/>
-                <w:szCs w:val="40"/>
-              </w:rPr>
-              <w:t>iÉÉ¤ÉþUÉÈ |</w:t>
-            </w:r>
-          </w:p>
-          <w:p>
-            <w:pPr>
-              <w:widowControl w:val="0"/>
-              <w:autoSpaceDE w:val="0"/>
-              <w:autoSpaceDN w:val="0"/>
-              <w:adjustRightInd w:val="0"/>
-              <w:spacing w:before="0" w:line="240" w:lineRule="auto"/>
-              <w:rPr>
-                <w:rFonts w:ascii="BRH Devanagari Extra" w:hAnsi="BRH Devanagari Extra" w:cs="BRH Devanagari Extra"/>
-                <w:color w:val="000000"/>
-                <w:sz w:val="32"/>
-                <w:szCs w:val="40"/>
-              </w:rPr>
-            </w:pPr>
-            <w:r>
-              <w:rPr>
-                <w:rFonts w:ascii="BRH Devanagari Extra" w:hAnsi="BRH Devanagari Extra" w:cs="BRH Devanagari Extra"/>
-                <w:color w:val="000000"/>
-                <w:sz w:val="32"/>
-                <w:szCs w:val="40"/>
-              </w:rPr>
-              <w:t>kÉ</w:t>
-            </w:r>
-            <w:r>
-              <w:rPr>
-                <w:rFonts w:ascii="BRH Malayalam Extra" w:hAnsi="BRH Malayalam Extra" w:cs="BRH Devanagari Extra"/>
-                <w:color w:val="000000"/>
-                <w:szCs w:val="40"/>
-                <w:highlight w:val="yellow"/>
-              </w:rPr>
-              <w:t>–</w:t>
-            </w:r>
-            <w:r>
-              <w:rPr>
-                <w:rFonts w:ascii="BRH Devanagari Extra" w:hAnsi="BRH Devanagari Extra" w:cs="BRH Devanagari Extra"/>
-                <w:color w:val="000000"/>
-                <w:sz w:val="32"/>
-                <w:szCs w:val="40"/>
-                <w:highlight w:val="yellow"/>
-              </w:rPr>
-              <w:t>¨É</w:t>
-            </w:r>
-            <w:r>
-              <w:rPr>
-                <w:rFonts w:ascii="BRH Devanagari Extra" w:hAnsi="BRH Devanagari Extra" w:cs="BRH Devanagari Extra"/>
-                <w:color w:val="000000"/>
-                <w:sz w:val="32"/>
-                <w:szCs w:val="40"/>
-              </w:rPr>
-              <w:t>å zÉ</w:t>
-            </w:r>
-            <w:r>
-              <w:rPr>
-                <w:rFonts w:ascii="BRH Malayalam Extra" w:hAnsi="BRH Malayalam Extra" w:cs="BRH Devanagari Extra"/>
-                <w:color w:val="000000"/>
-                <w:szCs w:val="40"/>
-              </w:rPr>
-              <w:t>–</w:t>
-            </w:r>
-            <w:r>
-              <w:rPr>
-                <w:rFonts w:ascii="BRH Devanagari Extra" w:hAnsi="BRH Devanagari Extra" w:cs="BRH Devanagari Extra"/>
-                <w:color w:val="000000"/>
-                <w:sz w:val="32"/>
-                <w:szCs w:val="40"/>
-              </w:rPr>
-              <w:t>iÉÉ¤ÉþUÉÈ zÉ</w:t>
-            </w:r>
-            <w:r>
-              <w:rPr>
-                <w:rFonts w:ascii="BRH Malayalam Extra" w:hAnsi="BRH Malayalam Extra" w:cs="BRH Devanagari Extra"/>
-                <w:color w:val="000000"/>
-                <w:szCs w:val="40"/>
-              </w:rPr>
-              <w:t>–</w:t>
-            </w:r>
-            <w:r>
-              <w:rPr>
-                <w:rFonts w:ascii="BRH Devanagari Extra" w:hAnsi="BRH Devanagari Extra" w:cs="BRH Devanagari Extra"/>
-                <w:color w:val="000000"/>
-                <w:sz w:val="32"/>
-                <w:szCs w:val="40"/>
-              </w:rPr>
-              <w:t xml:space="preserve">iÉÉ¤ÉþUÉ </w:t>
-            </w:r>
-            <w:r>
-              <w:rPr>
-                <w:rFonts w:ascii="BRH Devanagari Extra" w:hAnsi="BRH Devanagari Extra" w:cs="BRH Devanagari Extra"/>
-                <w:color w:val="000000"/>
-                <w:sz w:val="32"/>
-                <w:szCs w:val="40"/>
-                <w:highlight w:val="yellow"/>
-              </w:rPr>
-              <w:t>kÉ</w:t>
-            </w:r>
-            <w:r>
-              <w:rPr>
-                <w:rFonts w:ascii="BRH Malayalam Extra" w:hAnsi="BRH Malayalam Extra" w:cs="BRH Devanagari Extra"/>
-                <w:color w:val="000000"/>
-                <w:szCs w:val="40"/>
-              </w:rPr>
-              <w:t>–</w:t>
-            </w:r>
-            <w:r>
-              <w:rPr>
-                <w:rFonts w:ascii="BRH Devanagari Extra" w:hAnsi="BRH Devanagari Extra" w:cs="BRH Devanagari Extra"/>
-                <w:color w:val="000000"/>
-                <w:sz w:val="32"/>
-                <w:szCs w:val="40"/>
-              </w:rPr>
-              <w:t xml:space="preserve">¨Éå </w:t>
-            </w:r>
-            <w:r>
-              <w:rPr>
-                <w:rFonts w:ascii="BRH Devanagari Extra" w:hAnsi="BRH Devanagari Extra" w:cs="BRH Devanagari Extra"/>
-                <w:color w:val="000000"/>
-                <w:sz w:val="32"/>
-                <w:szCs w:val="40"/>
-                <w:highlight w:val="yellow"/>
-              </w:rPr>
-              <w:t>kÉ</w:t>
-            </w:r>
-            <w:r>
-              <w:rPr>
-                <w:rFonts w:ascii="BRH Malayalam Extra" w:hAnsi="BRH Malayalam Extra" w:cs="BRH Devanagari Extra"/>
-                <w:color w:val="000000"/>
-                <w:szCs w:val="40"/>
-                <w:highlight w:val="yellow"/>
-              </w:rPr>
-              <w:t>–</w:t>
-            </w:r>
-            <w:r>
-              <w:rPr>
-                <w:rFonts w:ascii="BRH Devanagari Extra" w:hAnsi="BRH Devanagari Extra" w:cs="BRH Devanagari Extra"/>
-                <w:color w:val="000000"/>
-                <w:sz w:val="32"/>
-                <w:szCs w:val="40"/>
-              </w:rPr>
-              <w:t>¨Éå zÉ</w:t>
-            </w:r>
-            <w:r>
-              <w:rPr>
-                <w:rFonts w:ascii="BRH Malayalam Extra" w:hAnsi="BRH Malayalam Extra" w:cs="BRH Devanagari Extra"/>
-                <w:color w:val="000000"/>
-                <w:szCs w:val="40"/>
-              </w:rPr>
-              <w:t>–</w:t>
-            </w:r>
-            <w:r>
-              <w:rPr>
-                <w:rFonts w:ascii="BRH Devanagari Extra" w:hAnsi="BRH Devanagari Extra" w:cs="BRH Devanagari Extra"/>
-                <w:color w:val="000000"/>
-                <w:sz w:val="32"/>
-                <w:szCs w:val="40"/>
-              </w:rPr>
-              <w:t xml:space="preserve">iÉÉ¤ÉþUÉÈ | </w:t>
+                <w:cs/>
+                <w:lang w:bidi="ta-IN"/>
+              </w:rPr>
+              <w:t>4</w:t>
+            </w:r>
+            <w:r>
+              <w:rPr>
+                <w:rFonts w:ascii="Latha" w:hAnsi="Latha" w:cs="Latha"/>
+                <w:szCs w:val="28"/>
+                <w:cs/>
+                <w:lang w:bidi="ta-IN"/>
+              </w:rPr>
+              <w:t>த்தே ஶ</w:t>
+            </w:r>
+            <w:r>
+              <w:rPr>
+                <w:rFonts w:ascii="BRH Tamil Tab Extra" w:hAnsi="BRH Tamil Tab Extra" w:cs="Latha"/>
+                <w:b/>
+                <w:bCs/>
+                <w:sz w:val="32"/>
+                <w:szCs w:val="28"/>
+                <w:lang w:bidi="ta-IN"/>
+              </w:rPr>
+              <w:t>…</w:t>
+            </w:r>
+            <w:r>
+              <w:rPr>
+                <w:rFonts w:ascii="Latha" w:hAnsi="Latha" w:cs="Latha"/>
+                <w:szCs w:val="28"/>
+                <w:cs/>
+                <w:lang w:bidi="ta-IN"/>
+              </w:rPr>
+              <w:t>தாக்ஷ</w:t>
+            </w:r>
+            <w:r>
+              <w:rPr>
+                <w:rFonts w:ascii="BRH Tamil Tab Extra" w:hAnsi="BRH Tamil Tab Extra" w:cs="Latha"/>
+                <w:b/>
+                <w:bCs/>
+                <w:sz w:val="32"/>
+                <w:szCs w:val="28"/>
+                <w:lang w:bidi="ta-IN"/>
+              </w:rPr>
+              <w:t>†</w:t>
+            </w:r>
+            <w:r>
+              <w:rPr>
+                <w:rFonts w:ascii="Latha" w:hAnsi="Latha" w:cs="Latha"/>
+                <w:szCs w:val="28"/>
+                <w:cs/>
+                <w:lang w:bidi="ta-IN"/>
+              </w:rPr>
+              <w:t>ரா</w:t>
+            </w:r>
+            <w:r>
+              <w:rPr>
+                <w:rFonts w:cs="Latha"/>
+                <w:b/>
+                <w:bCs/>
+                <w:szCs w:val="28"/>
+                <w:cs/>
+                <w:lang w:bidi="ta-IN"/>
+              </w:rPr>
+              <w:t>:</w:t>
+            </w:r>
+            <w:r>
+              <w:rPr>
+                <w:rFonts w:ascii="Latha" w:hAnsi="Latha" w:cs="Latha"/>
+                <w:szCs w:val="28"/>
+                <w:cs/>
+                <w:lang w:bidi="ta-IN"/>
+              </w:rPr>
+              <w:t xml:space="preserve"> </w:t>
+            </w:r>
+            <w:r>
+              <w:rPr>
+                <w:rFonts w:ascii="Latha" w:hAnsi="Latha" w:cs="Latha"/>
+                <w:szCs w:val="28"/>
+                <w:lang w:bidi="ta-IN"/>
+              </w:rPr>
+              <w:t>|</w:t>
             </w:r>
           </w:p>
           <w:p>
@@ -812,185 +1076,393 @@
           </w:tcPr>
           <w:p>
             <w:pPr>
-              <w:widowControl w:val="0"/>
               <w:autoSpaceDE w:val="0"/>
               <w:autoSpaceDN w:val="0"/>
               <w:adjustRightInd w:val="0"/>
-              <w:spacing w:before="0" w:line="240" w:lineRule="auto"/>
-              <w:rPr>
-                <w:rFonts w:ascii="BRH Devanagari Extra" w:hAnsi="BRH Devanagari Extra" w:cs="BRH Devanagari Extra"/>
-                <w:color w:val="000000"/>
-                <w:sz w:val="32"/>
-                <w:szCs w:val="40"/>
+              <w:rPr>
+                <w:rFonts w:ascii="Latha" w:hAnsi="Latha" w:cs="Latha"/>
+                <w:szCs w:val="28"/>
+                <w:lang w:bidi="ta-IN"/>
               </w:rPr>
             </w:pPr>
             <w:r>
               <w:rPr>
-                <w:rFonts w:cs="BRH Devanagari Extra"/>
-                <w:color w:val="000000"/>
-                <w:szCs w:val="40"/>
+                <w:rFonts w:cs="Latha"/>
+                <w:b/>
+                <w:bCs/>
+                <w:szCs w:val="28"/>
+                <w:cs/>
+                <w:lang w:bidi="ta-IN"/>
               </w:rPr>
               <w:t>57</w:t>
             </w:r>
             <w:r>
               <w:rPr>
-                <w:rFonts w:ascii="BRH Devanagari Extra" w:hAnsi="BRH Devanagari Extra" w:cs="BRH Devanagari Extra"/>
-                <w:color w:val="000000"/>
-                <w:sz w:val="32"/>
-                <w:szCs w:val="40"/>
+                <w:rFonts w:cs="Latha"/>
+                <w:b/>
+                <w:bCs/>
+                <w:szCs w:val="28"/>
+                <w:lang w:bidi="ta-IN"/>
               </w:rPr>
               <w:t>)</w:t>
             </w:r>
             <w:r>
               <w:rPr>
-                <w:rFonts w:ascii="BRH Devanagari Extra" w:hAnsi="BRH Devanagari Extra" w:cs="BRH Devanagari Extra"/>
-                <w:color w:val="000000"/>
-                <w:sz w:val="32"/>
-                <w:szCs w:val="40"/>
+                <w:rFonts w:ascii="Latha" w:hAnsi="Latha" w:cs="Latha"/>
+                <w:szCs w:val="28"/>
+                <w:lang w:bidi="ta-IN"/>
               </w:rPr>
               <w:tab/>
             </w:r>
             <w:r>
               <w:rPr>
-                <w:rFonts w:cs="BRH Devanagari Extra"/>
-                <w:color w:val="000000"/>
-                <w:szCs w:val="40"/>
+                <w:rFonts w:cs="Latha"/>
+                <w:b/>
+                <w:bCs/>
+                <w:szCs w:val="28"/>
+                <w:cs/>
+                <w:lang w:bidi="ta-IN"/>
+              </w:rPr>
+              <w:t>1.5</w:t>
+            </w:r>
+            <w:r>
+              <w:rPr>
+                <w:rFonts w:cs="Latha"/>
+                <w:b/>
+                <w:bCs/>
+                <w:szCs w:val="28"/>
+                <w:lang w:bidi="ta-IN"/>
+              </w:rPr>
+              <w:t>.2</w:t>
+            </w:r>
+            <w:r>
+              <w:rPr>
+                <w:rFonts w:ascii="Latha" w:hAnsi="Latha" w:cs="Latha"/>
+                <w:b/>
+                <w:bCs/>
+                <w:sz w:val="32"/>
+                <w:szCs w:val="32"/>
+                <w:lang w:bidi="ta-IN"/>
+              </w:rPr>
+              <w:t>.</w:t>
+            </w:r>
+            <w:r>
+              <w:rPr>
+                <w:rFonts w:cs="Latha"/>
+                <w:b/>
+                <w:bCs/>
+                <w:szCs w:val="28"/>
+                <w:cs/>
+                <w:lang w:bidi="ta-IN"/>
               </w:rPr>
               <w:t>1</w:t>
             </w:r>
             <w:r>
               <w:rPr>
-                <w:rFonts w:ascii="BRH Devanagari Extra" w:hAnsi="BRH Devanagari Extra" w:cs="BRH Devanagari Extra"/>
-                <w:color w:val="000000"/>
-                <w:sz w:val="32"/>
-                <w:szCs w:val="40"/>
-              </w:rPr>
-              <w:t>.</w:t>
-            </w:r>
-            <w:r>
-              <w:rPr>
-                <w:rFonts w:cs="BRH Devanagari Extra"/>
-                <w:color w:val="000000"/>
-                <w:szCs w:val="40"/>
+                <w:rFonts w:cs="Latha"/>
+                <w:b/>
+                <w:bCs/>
+                <w:szCs w:val="28"/>
+                <w:lang w:bidi="ta-IN"/>
+              </w:rPr>
+              <w:t>(</w:t>
+            </w:r>
+            <w:r>
+              <w:rPr>
+                <w:rFonts w:cs="Latha"/>
+                <w:b/>
+                <w:bCs/>
+                <w:szCs w:val="28"/>
+                <w:cs/>
+                <w:lang w:bidi="ta-IN"/>
               </w:rPr>
               <w:t>5</w:t>
             </w:r>
             <w:r>
               <w:rPr>
-                <w:rFonts w:ascii="BRH Devanagari Extra" w:hAnsi="BRH Devanagari Extra" w:cs="BRH Devanagari Extra"/>
-                <w:color w:val="000000"/>
-                <w:sz w:val="32"/>
-                <w:szCs w:val="40"/>
-              </w:rPr>
-              <w:t>.</w:t>
-            </w:r>
-            <w:r>
-              <w:rPr>
-                <w:rFonts w:cs="BRH Devanagari Extra"/>
-                <w:color w:val="000000"/>
-                <w:szCs w:val="40"/>
-              </w:rPr>
-              <w:t>2</w:t>
-            </w:r>
-            <w:r>
-              <w:rPr>
-                <w:rFonts w:ascii="BRH Devanagari Extra" w:hAnsi="BRH Devanagari Extra" w:cs="BRH Devanagari Extra"/>
-                <w:color w:val="000000"/>
-                <w:sz w:val="32"/>
-                <w:szCs w:val="40"/>
-              </w:rPr>
-              <w:t>.</w:t>
-            </w:r>
-            <w:r>
-              <w:rPr>
-                <w:rFonts w:cs="BRH Devanagari Extra"/>
-                <w:color w:val="000000"/>
-                <w:szCs w:val="40"/>
-              </w:rPr>
-              <w:t>1</w:t>
-            </w:r>
-            <w:r>
-              <w:rPr>
-                <w:rFonts w:ascii="BRH Devanagari Extra" w:hAnsi="BRH Devanagari Extra" w:cs="BRH Devanagari Extra"/>
-                <w:color w:val="000000"/>
-                <w:sz w:val="32"/>
-                <w:szCs w:val="40"/>
-              </w:rPr>
-              <w:t>(</w:t>
-            </w:r>
-            <w:r>
-              <w:rPr>
-                <w:rFonts w:cs="BRH Devanagari Extra"/>
-                <w:color w:val="000000"/>
-                <w:szCs w:val="40"/>
-              </w:rPr>
-              <w:t>50</w:t>
-            </w:r>
-            <w:r>
-              <w:rPr>
-                <w:rFonts w:ascii="BRH Devanagari Extra" w:hAnsi="BRH Devanagari Extra" w:cs="BRH Devanagari Extra"/>
-                <w:color w:val="000000"/>
-                <w:sz w:val="32"/>
-                <w:szCs w:val="40"/>
-              </w:rPr>
-              <w:t>)</w:t>
-            </w:r>
-            <w:proofErr w:type="gramStart"/>
-            <w:r>
-              <w:rPr>
-                <w:rFonts w:ascii="BRH Devanagari Extra" w:hAnsi="BRH Devanagari Extra" w:cs="BRH Devanagari Extra"/>
-                <w:color w:val="000000"/>
-                <w:sz w:val="32"/>
-                <w:szCs w:val="40"/>
-              </w:rPr>
-              <w:t>-  AÉ</w:t>
-            </w:r>
-            <w:proofErr w:type="gramEnd"/>
-            <w:r>
-              <w:rPr>
-                <w:rFonts w:ascii="BRH Devanagari Extra" w:hAnsi="BRH Devanagari Extra" w:cs="BRH Devanagari Extra"/>
-                <w:color w:val="000000"/>
-                <w:sz w:val="32"/>
-                <w:szCs w:val="40"/>
-              </w:rPr>
-              <w:t xml:space="preserve"> | kÉ</w:t>
-            </w:r>
-            <w:r>
-              <w:rPr>
-                <w:rFonts w:ascii="BRH Malayalam Extra" w:hAnsi="BRH Malayalam Extra" w:cs="BRH Devanagari Extra"/>
-                <w:color w:val="000000"/>
-                <w:szCs w:val="40"/>
+                <w:rFonts w:cs="Latha"/>
+                <w:b/>
+                <w:bCs/>
+                <w:szCs w:val="28"/>
+                <w:lang w:bidi="ta-IN"/>
+              </w:rPr>
+              <w:t>0)</w:t>
+            </w:r>
+            <w:r>
+              <w:rPr>
+                <w:rFonts w:ascii="Latha" w:hAnsi="Latha" w:cs="Latha"/>
+                <w:szCs w:val="28"/>
+                <w:lang w:bidi="ta-IN"/>
+              </w:rPr>
+              <w:t xml:space="preserve">-  </w:t>
+            </w:r>
+            <w:r>
+              <w:rPr>
+                <w:rFonts w:ascii="Latha" w:hAnsi="Latha" w:cs="Latha"/>
+                <w:szCs w:val="28"/>
+                <w:cs/>
+                <w:lang w:bidi="ta-IN"/>
+              </w:rPr>
+              <w:t xml:space="preserve">ஆ </w:t>
+            </w:r>
+            <w:r>
+              <w:rPr>
+                <w:rFonts w:ascii="Latha" w:hAnsi="Latha" w:cs="Latha"/>
+                <w:szCs w:val="28"/>
+                <w:lang w:bidi="ta-IN"/>
+              </w:rPr>
+              <w:t xml:space="preserve">| </w:t>
+            </w:r>
+            <w:r>
+              <w:rPr>
+                <w:rFonts w:ascii="Latha" w:hAnsi="Latha" w:cs="Latha"/>
+                <w:szCs w:val="28"/>
+                <w:cs/>
+                <w:lang w:bidi="ta-IN"/>
+              </w:rPr>
+              <w:t>த</w:t>
+            </w:r>
+            <w:r>
+              <w:rPr>
+                <w:rFonts w:ascii="BRH Tamil Tab Extra" w:hAnsi="BRH Tamil Tab Extra" w:cs="Latha"/>
+                <w:b/>
+                <w:bCs/>
+                <w:sz w:val="32"/>
+                <w:szCs w:val="28"/>
+                <w:lang w:bidi="ta-IN"/>
+              </w:rPr>
+              <w:t>…</w:t>
+            </w:r>
+            <w:r>
+              <w:rPr>
+                <w:rFonts w:ascii="Latha" w:hAnsi="Latha" w:cs="Latha"/>
+                <w:b/>
+                <w:bCs/>
+                <w:position w:val="-12"/>
+                <w:szCs w:val="28"/>
+                <w:cs/>
+                <w:lang w:bidi="ta-IN"/>
+              </w:rPr>
+              <w:t>4</w:t>
+            </w:r>
+            <w:r>
+              <w:rPr>
+                <w:rFonts w:ascii="Latha" w:hAnsi="Latha" w:cs="Latha"/>
+                <w:szCs w:val="28"/>
                 <w:highlight w:val="green"/>
-              </w:rPr>
-              <w:t>–</w:t>
-            </w:r>
-            <w:r>
-              <w:rPr>
-                <w:rFonts w:ascii="BRH Devanagari Extra" w:hAnsi="BRH Devanagari Extra" w:cs="BRH Devanagari Extra"/>
-                <w:color w:val="000000"/>
-                <w:sz w:val="32"/>
-                <w:szCs w:val="40"/>
+                <w:cs/>
+                <w:lang w:bidi="ta-IN"/>
+              </w:rPr>
+              <w:t>த்தே</w:t>
+            </w:r>
+            <w:r>
+              <w:rPr>
+                <w:rFonts w:ascii="BRH Tamil Tab Extra" w:hAnsi="BRH Tamil Tab Extra" w:cs="Latha"/>
+                <w:b/>
+                <w:bCs/>
+                <w:sz w:val="32"/>
+                <w:szCs w:val="28"/>
+                <w:lang w:bidi="ta-IN"/>
+              </w:rPr>
+              <w:t>…</w:t>
+            </w:r>
+            <w:r>
+              <w:rPr>
+                <w:rFonts w:ascii="Latha" w:hAnsi="Latha" w:cs="Latha"/>
+                <w:szCs w:val="28"/>
+                <w:cs/>
+                <w:lang w:bidi="ta-IN"/>
+              </w:rPr>
+              <w:t xml:space="preserve"> </w:t>
+            </w:r>
+            <w:r>
+              <w:rPr>
+                <w:rFonts w:ascii="Latha" w:hAnsi="Latha" w:cs="Latha"/>
+                <w:szCs w:val="28"/>
+                <w:lang w:bidi="ta-IN"/>
+              </w:rPr>
+              <w:t>|</w:t>
+            </w:r>
+          </w:p>
+          <w:p>
+            <w:pPr>
+              <w:autoSpaceDE w:val="0"/>
+              <w:autoSpaceDN w:val="0"/>
+              <w:adjustRightInd w:val="0"/>
+              <w:rPr>
+                <w:rFonts w:ascii="Latha" w:hAnsi="Latha" w:cs="Latha"/>
+                <w:szCs w:val="28"/>
+                <w:lang w:bidi="ta-IN"/>
+              </w:rPr>
+            </w:pPr>
+            <w:r>
+              <w:rPr>
+                <w:rFonts w:ascii="Latha" w:hAnsi="Latha" w:cs="Latha"/>
+                <w:szCs w:val="28"/>
+                <w:cs/>
+                <w:lang w:bidi="ta-IN"/>
+              </w:rPr>
+              <w:t xml:space="preserve">ஆ </w:t>
+            </w:r>
+            <w:r>
+              <w:rPr>
+                <w:rFonts w:ascii="Latha" w:hAnsi="Latha" w:cs="Latha"/>
+                <w:szCs w:val="28"/>
                 <w:highlight w:val="green"/>
-              </w:rPr>
-              <w:t>¨Éå</w:t>
-            </w:r>
-            <w:r>
-              <w:rPr>
-                <w:rFonts w:ascii="BRH Malayalam Extra" w:hAnsi="BRH Malayalam Extra" w:cs="BRH Devanagari Extra"/>
-                <w:color w:val="000000"/>
-                <w:szCs w:val="40"/>
+                <w:cs/>
+                <w:lang w:bidi="ta-IN"/>
+              </w:rPr>
+              <w:t>த</w:t>
+            </w:r>
+            <w:r>
+              <w:rPr>
+                <w:rFonts w:ascii="BRH Tamil Tab Extra" w:hAnsi="BRH Tamil Tab Extra" w:cs="Latha"/>
+                <w:b/>
+                <w:bCs/>
+                <w:sz w:val="32"/>
+                <w:szCs w:val="28"/>
                 <w:highlight w:val="green"/>
-              </w:rPr>
-              <w:t>–</w:t>
-            </w:r>
-            <w:r>
-              <w:rPr>
-                <w:rFonts w:ascii="BRH Devanagari Extra" w:hAnsi="BRH Devanagari Extra" w:cs="BRH Devanagari Extra"/>
-                <w:color w:val="000000"/>
-                <w:sz w:val="32"/>
-                <w:szCs w:val="40"/>
-              </w:rPr>
-              <w:t xml:space="preserve"> |</w:t>
+                <w:lang w:bidi="ta-IN"/>
+              </w:rPr>
+              <w:t>†</w:t>
+            </w:r>
+            <w:r>
+              <w:rPr>
+                <w:rFonts w:ascii="Latha" w:hAnsi="Latha" w:cs="Latha"/>
+                <w:b/>
+                <w:bCs/>
+                <w:position w:val="-12"/>
+                <w:szCs w:val="28"/>
+                <w:highlight w:val="green"/>
+                <w:cs/>
+                <w:lang w:bidi="ta-IN"/>
+              </w:rPr>
+              <w:t>4</w:t>
+            </w:r>
+            <w:r>
+              <w:rPr>
+                <w:rFonts w:ascii="Latha" w:hAnsi="Latha" w:cs="Latha"/>
+                <w:szCs w:val="28"/>
+                <w:highlight w:val="green"/>
+                <w:cs/>
+                <w:lang w:bidi="ta-IN"/>
+              </w:rPr>
+              <w:t>த்</w:t>
+            </w:r>
+            <w:r>
+              <w:rPr>
+                <w:rFonts w:ascii="Latha" w:hAnsi="Latha" w:cs="Latha"/>
+                <w:szCs w:val="28"/>
+                <w:cs/>
+                <w:lang w:bidi="ta-IN"/>
+              </w:rPr>
+              <w:t xml:space="preserve">தே </w:t>
+            </w:r>
+            <w:r>
+              <w:rPr>
+                <w:rFonts w:ascii="Latha" w:hAnsi="Latha" w:cs="Latha"/>
+                <w:szCs w:val="28"/>
+                <w:highlight w:val="green"/>
+                <w:cs/>
+                <w:lang w:bidi="ta-IN"/>
+              </w:rPr>
+              <w:t>த</w:t>
+            </w:r>
+            <w:r>
+              <w:rPr>
+                <w:rFonts w:ascii="Latha" w:hAnsi="Latha" w:cs="Latha"/>
+                <w:b/>
+                <w:bCs/>
+                <w:position w:val="-12"/>
+                <w:szCs w:val="28"/>
+                <w:highlight w:val="green"/>
+                <w:cs/>
+                <w:lang w:bidi="ta-IN"/>
+              </w:rPr>
+              <w:t>4</w:t>
+            </w:r>
+            <w:r>
+              <w:rPr>
+                <w:rFonts w:ascii="Latha" w:hAnsi="Latha" w:cs="Latha"/>
+                <w:szCs w:val="28"/>
+                <w:highlight w:val="green"/>
+                <w:cs/>
+                <w:lang w:bidi="ta-IN"/>
+              </w:rPr>
+              <w:t>த்த</w:t>
+            </w:r>
+            <w:r>
+              <w:rPr>
+                <w:rFonts w:ascii="BRH Tamil Tab Extra" w:hAnsi="BRH Tamil Tab Extra" w:cs="Latha"/>
+                <w:b/>
+                <w:bCs/>
+                <w:sz w:val="32"/>
+                <w:szCs w:val="28"/>
+                <w:highlight w:val="green"/>
+                <w:lang w:bidi="ta-IN"/>
+              </w:rPr>
+              <w:t>…</w:t>
+            </w:r>
+            <w:r>
+              <w:rPr>
+                <w:rFonts w:ascii="Latha" w:hAnsi="Latha" w:cs="Latha"/>
+                <w:szCs w:val="28"/>
+                <w:cs/>
+                <w:lang w:bidi="ta-IN"/>
+              </w:rPr>
+              <w:t xml:space="preserve"> ஆ </w:t>
+            </w:r>
+            <w:r>
+              <w:rPr>
+                <w:rFonts w:ascii="Latha" w:hAnsi="Latha" w:cs="Latha"/>
+                <w:szCs w:val="28"/>
+                <w:highlight w:val="green"/>
+                <w:cs/>
+                <w:lang w:bidi="ta-IN"/>
+              </w:rPr>
+              <w:t>த</w:t>
+            </w:r>
+            <w:r>
+              <w:rPr>
+                <w:rFonts w:ascii="BRH Tamil Tab Extra" w:hAnsi="BRH Tamil Tab Extra" w:cs="Latha"/>
+                <w:b/>
+                <w:bCs/>
+                <w:sz w:val="32"/>
+                <w:szCs w:val="28"/>
+                <w:highlight w:val="green"/>
+                <w:lang w:bidi="ta-IN"/>
+              </w:rPr>
+              <w:t>†</w:t>
+            </w:r>
+            <w:r>
+              <w:rPr>
+                <w:rFonts w:ascii="Latha" w:hAnsi="Latha" w:cs="Latha"/>
+                <w:b/>
+                <w:bCs/>
+                <w:position w:val="-12"/>
+                <w:szCs w:val="28"/>
+                <w:highlight w:val="green"/>
+                <w:cs/>
+                <w:lang w:bidi="ta-IN"/>
+              </w:rPr>
+              <w:t>4</w:t>
+            </w:r>
+            <w:r>
+              <w:rPr>
+                <w:rFonts w:ascii="Latha" w:hAnsi="Latha" w:cs="Latha"/>
+                <w:szCs w:val="28"/>
+                <w:cs/>
+                <w:lang w:bidi="ta-IN"/>
+              </w:rPr>
+              <w:t xml:space="preserve">த்தே </w:t>
+            </w:r>
+            <w:r>
+              <w:rPr>
+                <w:rFonts w:ascii="Latha" w:hAnsi="Latha" w:cs="Latha"/>
+                <w:szCs w:val="28"/>
+                <w:lang w:bidi="ta-IN"/>
+              </w:rPr>
+              <w:t xml:space="preserve">| </w:t>
             </w:r>
           </w:p>
           <w:p>
@@ -1001,86 +1473,186 @@
               <w:adjustRightInd w:val="0"/>
               <w:spacing w:before="0" w:line="240" w:lineRule="auto"/>
               <w:rPr>
-                <w:rFonts w:ascii="BRH Devanagari Extra" w:hAnsi="BRH Devanagari Extra" w:cs="BRH Devanagari Extra"/>
-                <w:color w:val="000000"/>
-                <w:sz w:val="32"/>
-                <w:szCs w:val="40"/>
+                <w:rFonts w:ascii="Latha" w:hAnsi="Latha" w:cs="Latha"/>
+                <w:szCs w:val="28"/>
+                <w:lang w:bidi="ta-IN"/>
               </w:rPr>
             </w:pPr>
             <w:r>
               <w:rPr>
-                <w:rFonts w:ascii="BRH Devanagari Extra" w:hAnsi="BRH Devanagari Extra" w:cs="BRH Devanagari Extra"/>
-                <w:color w:val="000000"/>
-                <w:sz w:val="32"/>
-                <w:szCs w:val="40"/>
-              </w:rPr>
-              <w:t xml:space="preserve">AÉ </w:t>
-            </w:r>
-            <w:r>
-              <w:rPr>
-                <w:rFonts w:ascii="BRH Devanagari Extra" w:hAnsi="BRH Devanagari Extra" w:cs="BRH Devanagari Extra"/>
-                <w:color w:val="000000"/>
-                <w:sz w:val="32"/>
-                <w:szCs w:val="40"/>
-                <w:highlight w:val="green"/>
-              </w:rPr>
-              <w:t>kÉ</w:t>
-            </w:r>
-            <w:r>
-              <w:rPr>
-                <w:rFonts w:ascii="BRH Devanagari Extra" w:hAnsi="BRH Devanagari Extra" w:cs="BRH Devanagari Extra"/>
-                <w:color w:val="000000"/>
-                <w:sz w:val="32"/>
-                <w:szCs w:val="40"/>
-              </w:rPr>
-              <w:t xml:space="preserve">þ¨Éå </w:t>
-            </w:r>
-            <w:r>
-              <w:rPr>
-                <w:rFonts w:ascii="BRH Devanagari Extra" w:hAnsi="BRH Devanagari Extra" w:cs="BRH Devanagari Extra"/>
-                <w:color w:val="000000"/>
-                <w:sz w:val="32"/>
-                <w:szCs w:val="40"/>
-                <w:highlight w:val="green"/>
-              </w:rPr>
-              <w:t>kÉ¨É</w:t>
-            </w:r>
-            <w:r>
-              <w:rPr>
-                <w:rFonts w:ascii="BRH Malayalam Extra" w:hAnsi="BRH Malayalam Extra" w:cs="BRH Devanagari Extra"/>
-                <w:color w:val="000000"/>
-                <w:szCs w:val="40"/>
-                <w:highlight w:val="yellow"/>
-              </w:rPr>
-              <w:t>–</w:t>
-            </w:r>
-            <w:r>
-              <w:rPr>
-                <w:rFonts w:ascii="BRH Devanagari Extra" w:hAnsi="BRH Devanagari Extra" w:cs="BRH Devanagari Extra"/>
-                <w:color w:val="000000"/>
-                <w:sz w:val="32"/>
-                <w:szCs w:val="40"/>
-              </w:rPr>
-              <w:t xml:space="preserve"> AÉ </w:t>
-            </w:r>
-            <w:r>
-              <w:rPr>
-                <w:rFonts w:ascii="BRH Devanagari Extra" w:hAnsi="BRH Devanagari Extra" w:cs="BRH Devanagari Extra"/>
-                <w:color w:val="000000"/>
-                <w:sz w:val="32"/>
-                <w:szCs w:val="40"/>
-                <w:highlight w:val="green"/>
-              </w:rPr>
-              <w:t>kÉ</w:t>
-            </w:r>
-            <w:r>
-              <w:rPr>
-                <w:rFonts w:ascii="BRH Devanagari Extra" w:hAnsi="BRH Devanagari Extra" w:cs="BRH Devanagari Extra"/>
-                <w:color w:val="000000"/>
-                <w:sz w:val="32"/>
-                <w:szCs w:val="40"/>
-              </w:rPr>
-              <w:t xml:space="preserve">þ¨Éå | </w:t>
+                <w:rFonts w:cs="Latha"/>
+                <w:b/>
+                <w:bCs/>
+                <w:szCs w:val="28"/>
+                <w:cs/>
+                <w:lang w:bidi="ta-IN"/>
+              </w:rPr>
+              <w:t>1.5</w:t>
+            </w:r>
+            <w:r>
+              <w:rPr>
+                <w:rFonts w:cs="Latha"/>
+                <w:b/>
+                <w:bCs/>
+                <w:szCs w:val="28"/>
+                <w:lang w:bidi="ta-IN"/>
+              </w:rPr>
+              <w:t>.2.2(</w:t>
+            </w:r>
+            <w:r>
+              <w:rPr>
+                <w:rFonts w:cs="Latha"/>
+                <w:b/>
+                <w:bCs/>
+                <w:szCs w:val="28"/>
+                <w:cs/>
+                <w:lang w:bidi="ta-IN"/>
+              </w:rPr>
+              <w:t>1</w:t>
+            </w:r>
+            <w:r>
+              <w:rPr>
+                <w:rFonts w:cs="Latha"/>
+                <w:b/>
+                <w:bCs/>
+                <w:szCs w:val="28"/>
+                <w:lang w:bidi="ta-IN"/>
+              </w:rPr>
+              <w:t>)</w:t>
+            </w:r>
+            <w:r>
+              <w:rPr>
+                <w:rFonts w:ascii="Latha" w:hAnsi="Latha" w:cs="Latha"/>
+                <w:szCs w:val="28"/>
+                <w:lang w:bidi="ta-IN"/>
+              </w:rPr>
+              <w:t xml:space="preserve">-  </w:t>
+            </w:r>
+            <w:r>
+              <w:rPr>
+                <w:rFonts w:ascii="Latha" w:hAnsi="Latha" w:cs="Latha"/>
+                <w:szCs w:val="28"/>
+                <w:cs/>
+                <w:lang w:bidi="ta-IN"/>
+              </w:rPr>
+              <w:t>த</w:t>
+            </w:r>
+            <w:r>
+              <w:rPr>
+                <w:rFonts w:ascii="BRH Tamil Tab Extra" w:hAnsi="BRH Tamil Tab Extra" w:cs="Latha"/>
+                <w:b/>
+                <w:bCs/>
+                <w:sz w:val="32"/>
+                <w:szCs w:val="28"/>
+                <w:lang w:bidi="ta-IN"/>
+              </w:rPr>
+              <w:t>…</w:t>
+            </w:r>
+            <w:r>
+              <w:rPr>
+                <w:rFonts w:ascii="Latha" w:hAnsi="Latha" w:cs="Latha"/>
+                <w:b/>
+                <w:bCs/>
+                <w:position w:val="-12"/>
+                <w:szCs w:val="28"/>
+                <w:cs/>
+                <w:lang w:bidi="ta-IN"/>
+              </w:rPr>
+              <w:t>4</w:t>
+            </w:r>
+            <w:r>
+              <w:rPr>
+                <w:rFonts w:ascii="Latha" w:hAnsi="Latha" w:cs="Latha"/>
+                <w:szCs w:val="28"/>
+                <w:cs/>
+                <w:lang w:bidi="ta-IN"/>
+              </w:rPr>
+              <w:t xml:space="preserve">த்தே </w:t>
+            </w:r>
+            <w:r>
+              <w:rPr>
+                <w:rFonts w:ascii="Latha" w:hAnsi="Latha" w:cs="Latha"/>
+                <w:szCs w:val="28"/>
+                <w:lang w:bidi="ta-IN"/>
+              </w:rPr>
+              <w:t xml:space="preserve">| </w:t>
+            </w:r>
+            <w:r>
+              <w:rPr>
+                <w:rFonts w:ascii="Latha" w:hAnsi="Latha" w:cs="Latha"/>
+                <w:szCs w:val="28"/>
+                <w:cs/>
+                <w:lang w:bidi="ta-IN"/>
+              </w:rPr>
+              <w:t>ஶ</w:t>
+            </w:r>
+            <w:r>
+              <w:rPr>
+                <w:rFonts w:ascii="BRH Tamil Tab Extra" w:hAnsi="BRH Tamil Tab Extra" w:cs="Latha"/>
+                <w:b/>
+                <w:bCs/>
+                <w:sz w:val="32"/>
+                <w:szCs w:val="28"/>
+                <w:lang w:bidi="ta-IN"/>
+              </w:rPr>
+              <w:t>…</w:t>
+            </w:r>
+            <w:r>
+              <w:rPr>
+                <w:rFonts w:ascii="Latha" w:hAnsi="Latha" w:cs="Latha"/>
+                <w:szCs w:val="28"/>
+                <w:cs/>
+                <w:lang w:bidi="ta-IN"/>
+              </w:rPr>
+              <w:t>தாக்ஷ</w:t>
+            </w:r>
+            <w:r>
+              <w:rPr>
+                <w:rFonts w:ascii="BRH Tamil Tab Extra" w:hAnsi="BRH Tamil Tab Extra" w:cs="Latha"/>
+                <w:b/>
+                <w:bCs/>
+                <w:sz w:val="32"/>
+                <w:szCs w:val="28"/>
+                <w:lang w:bidi="ta-IN"/>
+              </w:rPr>
+              <w:t>†</w:t>
+            </w:r>
+            <w:r>
+              <w:rPr>
+                <w:rFonts w:ascii="Latha" w:hAnsi="Latha" w:cs="Latha"/>
+                <w:szCs w:val="28"/>
+                <w:cs/>
+                <w:lang w:bidi="ta-IN"/>
+              </w:rPr>
+              <w:t>ரா</w:t>
+            </w:r>
+            <w:r>
+              <w:rPr>
+                <w:rFonts w:cs="Latha"/>
+                <w:b/>
+                <w:bCs/>
+                <w:szCs w:val="28"/>
+                <w:cs/>
+                <w:lang w:bidi="ta-IN"/>
+              </w:rPr>
+              <w:t>:</w:t>
+            </w:r>
+            <w:r>
+              <w:rPr>
+                <w:rFonts w:ascii="Latha" w:hAnsi="Latha" w:cs="Latha"/>
+                <w:szCs w:val="28"/>
+                <w:cs/>
+                <w:lang w:bidi="ta-IN"/>
+              </w:rPr>
+              <w:t xml:space="preserve"> </w:t>
+            </w:r>
+            <w:r>
+              <w:rPr>
+                <w:rFonts w:ascii="Latha" w:hAnsi="Latha" w:cs="Latha"/>
+                <w:szCs w:val="28"/>
+                <w:lang w:bidi="ta-IN"/>
+              </w:rPr>
+              <w:t>|</w:t>
             </w:r>
           </w:p>
           <w:p>
@@ -1099,179 +1671,307 @@
             </w:pPr>
             <w:r>
               <w:rPr>
-                <w:rFonts w:cs="BRH Devanagari Extra"/>
-                <w:color w:val="000000"/>
-                <w:szCs w:val="40"/>
-              </w:rPr>
-              <w:t>1</w:t>
-            </w:r>
-            <w:r>
-              <w:rPr>
-                <w:rFonts w:ascii="BRH Devanagari Extra" w:hAnsi="BRH Devanagari Extra" w:cs="BRH Devanagari Extra"/>
-                <w:color w:val="000000"/>
-                <w:sz w:val="32"/>
-                <w:szCs w:val="40"/>
-              </w:rPr>
-              <w:t>)</w:t>
-            </w:r>
-            <w:r>
-              <w:rPr>
-                <w:rFonts w:ascii="BRH Devanagari Extra" w:hAnsi="BRH Devanagari Extra" w:cs="BRH Devanagari Extra"/>
-                <w:color w:val="000000"/>
-                <w:sz w:val="32"/>
-                <w:szCs w:val="40"/>
-              </w:rPr>
-              <w:tab/>
-            </w:r>
-            <w:r>
-              <w:rPr>
-                <w:rFonts w:cs="BRH Devanagari Extra"/>
-                <w:color w:val="000000"/>
-                <w:szCs w:val="40"/>
-              </w:rPr>
-              <w:t>1</w:t>
-            </w:r>
-            <w:r>
-              <w:rPr>
-                <w:rFonts w:ascii="BRH Devanagari Extra" w:hAnsi="BRH Devanagari Extra" w:cs="BRH Devanagari Extra"/>
-                <w:color w:val="000000"/>
-                <w:sz w:val="32"/>
-                <w:szCs w:val="40"/>
-              </w:rPr>
-              <w:t>.</w:t>
-            </w:r>
-            <w:r>
-              <w:rPr>
-                <w:rFonts w:cs="BRH Devanagari Extra"/>
-                <w:color w:val="000000"/>
-                <w:szCs w:val="40"/>
-              </w:rPr>
-              <w:t>5</w:t>
-            </w:r>
-            <w:r>
-              <w:rPr>
-                <w:rFonts w:ascii="BRH Devanagari Extra" w:hAnsi="BRH Devanagari Extra" w:cs="BRH Devanagari Extra"/>
-                <w:color w:val="000000"/>
-                <w:sz w:val="32"/>
-                <w:szCs w:val="40"/>
-              </w:rPr>
-              <w:t>.</w:t>
-            </w:r>
-            <w:r>
-              <w:rPr>
-                <w:rFonts w:cs="BRH Devanagari Extra"/>
-                <w:color w:val="000000"/>
-                <w:szCs w:val="40"/>
-              </w:rPr>
-              <w:t>2</w:t>
-            </w:r>
-            <w:r>
-              <w:rPr>
-                <w:rFonts w:ascii="BRH Devanagari Extra" w:hAnsi="BRH Devanagari Extra" w:cs="BRH Devanagari Extra"/>
-                <w:color w:val="000000"/>
-                <w:sz w:val="32"/>
-                <w:szCs w:val="40"/>
-              </w:rPr>
-              <w:t>.</w:t>
-            </w:r>
-            <w:r>
-              <w:rPr>
-                <w:rFonts w:cs="BRH Devanagari Extra"/>
-                <w:color w:val="000000"/>
-                <w:szCs w:val="40"/>
-              </w:rPr>
-              <w:t>2</w:t>
-            </w:r>
-            <w:r>
-              <w:rPr>
-                <w:rFonts w:ascii="BRH Devanagari Extra" w:hAnsi="BRH Devanagari Extra" w:cs="BRH Devanagari Extra"/>
-                <w:color w:val="000000"/>
-                <w:sz w:val="32"/>
-                <w:szCs w:val="40"/>
-              </w:rPr>
-              <w:t>(</w:t>
-            </w:r>
-            <w:r>
-              <w:rPr>
-                <w:rFonts w:cs="BRH Devanagari Extra"/>
-                <w:color w:val="000000"/>
-                <w:szCs w:val="40"/>
-              </w:rPr>
-              <w:t>1</w:t>
-            </w:r>
-            <w:r>
-              <w:rPr>
-                <w:rFonts w:ascii="BRH Devanagari Extra" w:hAnsi="BRH Devanagari Extra" w:cs="BRH Devanagari Extra"/>
-                <w:color w:val="000000"/>
-                <w:sz w:val="32"/>
-                <w:szCs w:val="40"/>
-              </w:rPr>
-              <w:t>)</w:t>
-            </w:r>
-            <w:proofErr w:type="gramStart"/>
-            <w:r>
-              <w:rPr>
-                <w:rFonts w:ascii="BRH Devanagari Extra" w:hAnsi="BRH Devanagari Extra" w:cs="BRH Devanagari Extra"/>
-                <w:color w:val="000000"/>
-                <w:sz w:val="32"/>
-                <w:szCs w:val="40"/>
-              </w:rPr>
-              <w:t>-  kÉ</w:t>
-            </w:r>
-            <w:proofErr w:type="gramEnd"/>
-            <w:r>
-              <w:rPr>
-                <w:rFonts w:ascii="BRH Malayalam Extra" w:hAnsi="BRH Malayalam Extra" w:cs="BRH Devanagari Extra"/>
-                <w:color w:val="000000"/>
-                <w:szCs w:val="40"/>
+                <w:rFonts w:ascii="Latha" w:hAnsi="Latha" w:cs="Latha"/>
+                <w:szCs w:val="28"/>
+                <w:cs/>
+                <w:lang w:bidi="ta-IN"/>
+              </w:rPr>
+              <w:t>த</w:t>
+            </w:r>
+            <w:r>
+              <w:rPr>
+                <w:rFonts w:ascii="BRH Tamil Tab Extra" w:hAnsi="BRH Tamil Tab Extra" w:cs="Latha"/>
+                <w:b/>
+                <w:bCs/>
+                <w:sz w:val="32"/>
+                <w:szCs w:val="28"/>
+                <w:lang w:bidi="ta-IN"/>
+              </w:rPr>
+              <w:t>…</w:t>
+            </w:r>
+            <w:r>
+              <w:rPr>
+                <w:rFonts w:ascii="Latha" w:hAnsi="Latha" w:cs="Latha"/>
+                <w:b/>
+                <w:bCs/>
+                <w:position w:val="-12"/>
+                <w:szCs w:val="28"/>
+                <w:cs/>
+                <w:lang w:bidi="ta-IN"/>
+              </w:rPr>
+              <w:t>4</w:t>
+            </w:r>
+            <w:r>
+              <w:rPr>
+                <w:rFonts w:ascii="Latha" w:hAnsi="Latha" w:cs="Latha"/>
+                <w:szCs w:val="28"/>
                 <w:highlight w:val="green"/>
-              </w:rPr>
-              <w:t>–</w:t>
-            </w:r>
-            <w:r>
-              <w:rPr>
-                <w:rFonts w:ascii="BRH Devanagari Extra" w:hAnsi="BRH Devanagari Extra" w:cs="BRH Devanagari Extra"/>
-                <w:color w:val="000000"/>
-                <w:sz w:val="32"/>
-                <w:szCs w:val="40"/>
+                <w:cs/>
+                <w:lang w:bidi="ta-IN"/>
+              </w:rPr>
+              <w:t>த்தே</w:t>
+            </w:r>
+            <w:r>
+              <w:rPr>
+                <w:rFonts w:ascii="BRH Tamil Tab Extra" w:hAnsi="BRH Tamil Tab Extra" w:cs="Latha"/>
+                <w:b/>
+                <w:bCs/>
+                <w:sz w:val="32"/>
+                <w:szCs w:val="28"/>
+                <w:lang w:bidi="ta-IN"/>
+              </w:rPr>
+              <w:t>…</w:t>
+            </w:r>
+            <w:r>
+              <w:rPr>
+                <w:rFonts w:ascii="Latha" w:hAnsi="Latha" w:cs="Latha"/>
+                <w:szCs w:val="28"/>
+                <w:cs/>
+                <w:lang w:bidi="ta-IN"/>
+              </w:rPr>
+              <w:t xml:space="preserve"> ஶ</w:t>
+            </w:r>
+            <w:r>
+              <w:rPr>
+                <w:rFonts w:ascii="BRH Tamil Tab Extra" w:hAnsi="BRH Tamil Tab Extra" w:cs="Latha"/>
+                <w:b/>
+                <w:bCs/>
+                <w:sz w:val="32"/>
+                <w:szCs w:val="28"/>
+                <w:lang w:bidi="ta-IN"/>
+              </w:rPr>
+              <w:t>…</w:t>
+            </w:r>
+            <w:r>
+              <w:rPr>
+                <w:rFonts w:ascii="Latha" w:hAnsi="Latha" w:cs="Latha"/>
+                <w:szCs w:val="28"/>
+                <w:cs/>
+                <w:lang w:bidi="ta-IN"/>
+              </w:rPr>
+              <w:t>தாக்ஷ</w:t>
+            </w:r>
+            <w:r>
+              <w:rPr>
+                <w:rFonts w:ascii="BRH Tamil Tab Extra" w:hAnsi="BRH Tamil Tab Extra" w:cs="Latha"/>
+                <w:b/>
+                <w:bCs/>
+                <w:sz w:val="32"/>
+                <w:szCs w:val="28"/>
+                <w:lang w:bidi="ta-IN"/>
+              </w:rPr>
+              <w:t>†</w:t>
+            </w:r>
+            <w:r>
+              <w:rPr>
+                <w:rFonts w:ascii="Latha" w:hAnsi="Latha" w:cs="Latha"/>
+                <w:szCs w:val="28"/>
+                <w:cs/>
+                <w:lang w:bidi="ta-IN"/>
+              </w:rPr>
+              <w:t>ரா</w:t>
+            </w:r>
+            <w:r>
+              <w:rPr>
+                <w:rFonts w:cs="Latha"/>
+                <w:b/>
+                <w:bCs/>
+                <w:szCs w:val="28"/>
+                <w:cs/>
+                <w:lang w:bidi="ta-IN"/>
+              </w:rPr>
+              <w:t>:</w:t>
+            </w:r>
+            <w:r>
+              <w:rPr>
+                <w:rFonts w:ascii="Latha" w:hAnsi="Latha" w:cs="Latha"/>
+                <w:szCs w:val="28"/>
+                <w:cs/>
+                <w:lang w:bidi="ta-IN"/>
+              </w:rPr>
+              <w:t xml:space="preserve"> ஶ</w:t>
+            </w:r>
+            <w:r>
+              <w:rPr>
+                <w:rFonts w:ascii="BRH Tamil Tab Extra" w:hAnsi="BRH Tamil Tab Extra" w:cs="Latha"/>
+                <w:b/>
+                <w:bCs/>
+                <w:sz w:val="32"/>
+                <w:szCs w:val="28"/>
+                <w:lang w:bidi="ta-IN"/>
+              </w:rPr>
+              <w:t>…</w:t>
+            </w:r>
+            <w:r>
+              <w:rPr>
+                <w:rFonts w:ascii="Latha" w:hAnsi="Latha" w:cs="Latha"/>
+                <w:szCs w:val="28"/>
+                <w:cs/>
+                <w:lang w:bidi="ta-IN"/>
+              </w:rPr>
+              <w:t>தாக்ஷ</w:t>
+            </w:r>
+            <w:r>
+              <w:rPr>
+                <w:rFonts w:ascii="BRH Tamil Tab Extra" w:hAnsi="BRH Tamil Tab Extra" w:cs="Latha"/>
+                <w:b/>
+                <w:bCs/>
+                <w:sz w:val="32"/>
+                <w:szCs w:val="28"/>
+                <w:lang w:bidi="ta-IN"/>
+              </w:rPr>
+              <w:t>†</w:t>
+            </w:r>
+            <w:r>
+              <w:rPr>
+                <w:rFonts w:ascii="Latha" w:hAnsi="Latha" w:cs="Latha"/>
+                <w:szCs w:val="28"/>
+                <w:cs/>
+                <w:lang w:bidi="ta-IN"/>
+              </w:rPr>
+              <w:t xml:space="preserve">ரா </w:t>
+            </w:r>
+            <w:r>
+              <w:rPr>
+                <w:rFonts w:ascii="Latha" w:hAnsi="Latha" w:cs="Latha"/>
+                <w:szCs w:val="28"/>
                 <w:highlight w:val="green"/>
-              </w:rPr>
-              <w:t>¨É</w:t>
-            </w:r>
-            <w:r>
-              <w:rPr>
-                <w:rFonts w:ascii="BRH Malayalam Extra" w:hAnsi="BRH Malayalam Extra" w:cs="BRH Devanagari Extra"/>
-                <w:color w:val="000000"/>
-                <w:szCs w:val="40"/>
-                <w:highlight w:val="yellow"/>
-              </w:rPr>
-              <w:t>–</w:t>
-            </w:r>
-            <w:r>
-              <w:rPr>
-                <w:rFonts w:ascii="BRH Devanagari Extra" w:hAnsi="BRH Devanagari Extra" w:cs="BRH Devanagari Extra"/>
-                <w:color w:val="000000"/>
-                <w:sz w:val="32"/>
-                <w:szCs w:val="40"/>
-              </w:rPr>
-              <w:t>å | zÉ</w:t>
-            </w:r>
-            <w:r>
-              <w:rPr>
-                <w:rFonts w:ascii="BRH Malayalam Extra" w:hAnsi="BRH Malayalam Extra" w:cs="BRH Devanagari Extra"/>
-                <w:color w:val="000000"/>
-                <w:szCs w:val="40"/>
-              </w:rPr>
-              <w:t>–</w:t>
-            </w:r>
-            <w:r>
-              <w:rPr>
-                <w:rFonts w:ascii="BRH Devanagari Extra" w:hAnsi="BRH Devanagari Extra" w:cs="BRH Devanagari Extra"/>
-                <w:color w:val="000000"/>
-                <w:sz w:val="32"/>
-                <w:szCs w:val="40"/>
-              </w:rPr>
-              <w:t>iÉÉ¤ÉþUÉÈ |</w:t>
+                <w:cs/>
+                <w:lang w:bidi="ta-IN"/>
+              </w:rPr>
+              <w:t>த</w:t>
+            </w:r>
+            <w:r>
+              <w:rPr>
+                <w:rFonts w:ascii="Latha" w:hAnsi="Latha" w:cs="Latha"/>
+                <w:b/>
+                <w:bCs/>
+                <w:position w:val="-12"/>
+                <w:szCs w:val="28"/>
+                <w:highlight w:val="green"/>
+                <w:cs/>
+                <w:lang w:bidi="ta-IN"/>
+              </w:rPr>
+              <w:t>4</w:t>
+            </w:r>
+            <w:r>
+              <w:rPr>
+                <w:rFonts w:ascii="Latha" w:hAnsi="Latha" w:cs="Latha"/>
+                <w:szCs w:val="28"/>
+                <w:cs/>
+                <w:lang w:bidi="ta-IN"/>
+              </w:rPr>
+              <w:t xml:space="preserve">த்தே </w:t>
+            </w:r>
+            <w:r>
+              <w:rPr>
+                <w:rFonts w:ascii="Latha" w:hAnsi="Latha" w:cs="Latha"/>
+                <w:szCs w:val="28"/>
+                <w:highlight w:val="green"/>
+                <w:cs/>
+                <w:lang w:bidi="ta-IN"/>
+              </w:rPr>
+              <w:t>த</w:t>
+            </w:r>
+            <w:r>
+              <w:rPr>
+                <w:rFonts w:ascii="Latha" w:hAnsi="Latha" w:cs="Latha"/>
+                <w:b/>
+                <w:bCs/>
+                <w:position w:val="-12"/>
+                <w:szCs w:val="28"/>
+                <w:highlight w:val="green"/>
+                <w:cs/>
+                <w:lang w:bidi="ta-IN"/>
+              </w:rPr>
+              <w:t>4</w:t>
+            </w:r>
+            <w:r>
+              <w:rPr>
+                <w:rFonts w:ascii="Latha" w:hAnsi="Latha" w:cs="Latha"/>
+                <w:szCs w:val="28"/>
+                <w:highlight w:val="green"/>
+                <w:cs/>
+                <w:lang w:bidi="ta-IN"/>
+              </w:rPr>
+              <w:t>த்</w:t>
+            </w:r>
+            <w:r>
+              <w:rPr>
+                <w:rFonts w:ascii="Latha" w:hAnsi="Latha" w:cs="Latha"/>
+                <w:szCs w:val="28"/>
+                <w:cs/>
+                <w:lang w:bidi="ta-IN"/>
+              </w:rPr>
+              <w:t>தே ஶ</w:t>
+            </w:r>
+            <w:r>
+              <w:rPr>
+                <w:rFonts w:ascii="BRH Tamil Tab Extra" w:hAnsi="BRH Tamil Tab Extra" w:cs="Latha"/>
+                <w:b/>
+                <w:bCs/>
+                <w:sz w:val="32"/>
+                <w:szCs w:val="28"/>
+                <w:lang w:bidi="ta-IN"/>
+              </w:rPr>
+              <w:t>…</w:t>
+            </w:r>
+            <w:r>
+              <w:rPr>
+                <w:rFonts w:ascii="Latha" w:hAnsi="Latha" w:cs="Latha"/>
+                <w:szCs w:val="28"/>
+                <w:cs/>
+                <w:lang w:bidi="ta-IN"/>
+              </w:rPr>
+              <w:t>தாக்ஷ</w:t>
+            </w:r>
+            <w:r>
+              <w:rPr>
+                <w:rFonts w:ascii="BRH Tamil Tab Extra" w:hAnsi="BRH Tamil Tab Extra" w:cs="Latha"/>
+                <w:b/>
+                <w:bCs/>
+                <w:sz w:val="32"/>
+                <w:szCs w:val="28"/>
+                <w:lang w:bidi="ta-IN"/>
+              </w:rPr>
+              <w:t>†</w:t>
+            </w:r>
+            <w:r>
+              <w:rPr>
+                <w:rFonts w:ascii="Latha" w:hAnsi="Latha" w:cs="Latha"/>
+                <w:szCs w:val="28"/>
+                <w:cs/>
+                <w:lang w:bidi="ta-IN"/>
+              </w:rPr>
+              <w:t>ரா</w:t>
+            </w:r>
+            <w:r>
+              <w:rPr>
+                <w:rFonts w:cs="Latha"/>
+                <w:b/>
+                <w:bCs/>
+                <w:szCs w:val="28"/>
+                <w:cs/>
+                <w:lang w:bidi="ta-IN"/>
+              </w:rPr>
+              <w:t>:</w:t>
+            </w:r>
+            <w:r>
+              <w:rPr>
+                <w:rFonts w:ascii="Latha" w:hAnsi="Latha" w:cs="Latha"/>
+                <w:szCs w:val="28"/>
+                <w:cs/>
+                <w:lang w:bidi="ta-IN"/>
+              </w:rPr>
+              <w:t xml:space="preserve"> </w:t>
+            </w:r>
+            <w:r>
+              <w:rPr>
+                <w:rFonts w:ascii="Latha" w:hAnsi="Latha" w:cs="Latha"/>
+                <w:szCs w:val="28"/>
+                <w:lang w:bidi="ta-IN"/>
+              </w:rPr>
+              <w:t>|</w:t>
             </w:r>
           </w:p>
           <w:p>
@@ -1282,160 +1982,1339 @@
               <w:adjustRightInd w:val="0"/>
               <w:spacing w:before="0" w:line="240" w:lineRule="auto"/>
               <w:rPr>
-                <w:rFonts w:ascii="BRH Devanagari Extra" w:hAnsi="BRH Devanagari Extra" w:cs="BRH Devanagari Extra"/>
-                <w:color w:val="000000"/>
-                <w:sz w:val="32"/>
+                <w:rFonts w:cs="BRH Malayalam Extra"/>
                 <w:szCs w:val="40"/>
               </w:rPr>
             </w:pPr>
-            <w:r>
-              <w:rPr>
-                <w:rFonts w:ascii="BRH Devanagari Extra" w:hAnsi="BRH Devanagari Extra" w:cs="BRH Devanagari Extra"/>
-                <w:color w:val="000000"/>
-                <w:sz w:val="32"/>
-                <w:szCs w:val="40"/>
-              </w:rPr>
-              <w:t>kÉ</w:t>
-            </w:r>
-            <w:r>
-              <w:rPr>
-                <w:rFonts w:ascii="BRH Malayalam Extra" w:hAnsi="BRH Malayalam Extra" w:cs="BRH Devanagari Extra"/>
-                <w:color w:val="000000"/>
-                <w:szCs w:val="40"/>
-                <w:highlight w:val="green"/>
-              </w:rPr>
-              <w:t>–</w:t>
-            </w:r>
-            <w:r>
-              <w:rPr>
-                <w:rFonts w:ascii="BRH Devanagari Extra" w:hAnsi="BRH Devanagari Extra" w:cs="BRH Devanagari Extra"/>
-                <w:color w:val="000000"/>
-                <w:sz w:val="32"/>
-                <w:szCs w:val="40"/>
-                <w:highlight w:val="green"/>
-              </w:rPr>
-              <w:t>¨Éå</w:t>
-            </w:r>
-            <w:r>
-              <w:rPr>
-                <w:rFonts w:ascii="BRH Malayalam Extra" w:hAnsi="BRH Malayalam Extra" w:cs="BRH Devanagari Extra"/>
-                <w:color w:val="000000"/>
-                <w:szCs w:val="40"/>
-                <w:highlight w:val="green"/>
-              </w:rPr>
-              <w:t>–</w:t>
-            </w:r>
-            <w:r>
-              <w:rPr>
-                <w:rFonts w:ascii="BRH Devanagari Extra" w:hAnsi="BRH Devanagari Extra" w:cs="BRH Devanagari Extra"/>
-                <w:color w:val="000000"/>
-                <w:sz w:val="32"/>
-                <w:szCs w:val="40"/>
-              </w:rPr>
-              <w:t xml:space="preserve"> zÉ</w:t>
-            </w:r>
-            <w:r>
-              <w:rPr>
-                <w:rFonts w:ascii="BRH Malayalam Extra" w:hAnsi="BRH Malayalam Extra" w:cs="BRH Devanagari Extra"/>
-                <w:color w:val="000000"/>
-                <w:szCs w:val="40"/>
-              </w:rPr>
-              <w:t>–</w:t>
-            </w:r>
-            <w:r>
-              <w:rPr>
-                <w:rFonts w:ascii="BRH Devanagari Extra" w:hAnsi="BRH Devanagari Extra" w:cs="BRH Devanagari Extra"/>
-                <w:color w:val="000000"/>
-                <w:sz w:val="32"/>
-                <w:szCs w:val="40"/>
-              </w:rPr>
-              <w:t>iÉÉ¤ÉþUÉÈ zÉ</w:t>
-            </w:r>
-            <w:r>
-              <w:rPr>
-                <w:rFonts w:ascii="BRH Malayalam Extra" w:hAnsi="BRH Malayalam Extra" w:cs="BRH Devanagari Extra"/>
-                <w:color w:val="000000"/>
-                <w:szCs w:val="40"/>
-              </w:rPr>
-              <w:t>–</w:t>
-            </w:r>
-            <w:r>
-              <w:rPr>
-                <w:rFonts w:ascii="BRH Devanagari Extra" w:hAnsi="BRH Devanagari Extra" w:cs="BRH Devanagari Extra"/>
-                <w:color w:val="000000"/>
-                <w:sz w:val="32"/>
-                <w:szCs w:val="40"/>
-              </w:rPr>
-              <w:t xml:space="preserve">iÉÉ¤ÉþUÉ </w:t>
-            </w:r>
-            <w:r>
-              <w:rPr>
-                <w:rFonts w:ascii="BRH Devanagari Extra" w:hAnsi="BRH Devanagari Extra" w:cs="BRH Devanagari Extra"/>
-                <w:color w:val="000000"/>
-                <w:sz w:val="32"/>
-                <w:szCs w:val="40"/>
-                <w:highlight w:val="green"/>
-              </w:rPr>
-              <w:t>kÉ</w:t>
-            </w:r>
-            <w:r>
-              <w:rPr>
-                <w:rFonts w:ascii="BRH Devanagari Extra" w:hAnsi="BRH Devanagari Extra" w:cs="BRH Devanagari Extra"/>
-                <w:color w:val="000000"/>
-                <w:sz w:val="32"/>
-                <w:szCs w:val="40"/>
-              </w:rPr>
-              <w:t xml:space="preserve">¨Éå </w:t>
-            </w:r>
-            <w:r>
-              <w:rPr>
-                <w:rFonts w:ascii="BRH Devanagari Extra" w:hAnsi="BRH Devanagari Extra" w:cs="BRH Devanagari Extra"/>
-                <w:color w:val="000000"/>
-                <w:sz w:val="32"/>
-                <w:szCs w:val="40"/>
-                <w:highlight w:val="green"/>
-              </w:rPr>
-              <w:t>kÉ</w:t>
-            </w:r>
-            <w:r>
-              <w:rPr>
-                <w:rFonts w:ascii="BRH Devanagari Extra" w:hAnsi="BRH Devanagari Extra" w:cs="BRH Devanagari Extra"/>
-                <w:color w:val="000000"/>
-                <w:sz w:val="32"/>
-                <w:szCs w:val="40"/>
-              </w:rPr>
-              <w:t>¨Éå zÉ</w:t>
-            </w:r>
-            <w:r>
-              <w:rPr>
-                <w:rFonts w:ascii="BRH Malayalam Extra" w:hAnsi="BRH Malayalam Extra" w:cs="BRH Devanagari Extra"/>
-                <w:color w:val="000000"/>
-                <w:szCs w:val="40"/>
-              </w:rPr>
-              <w:t>–</w:t>
-            </w:r>
-            <w:r>
-              <w:rPr>
-                <w:rFonts w:ascii="BRH Devanagari Extra" w:hAnsi="BRH Devanagari Extra" w:cs="BRH Devanagari Extra"/>
-                <w:color w:val="000000"/>
-                <w:sz w:val="32"/>
-                <w:szCs w:val="40"/>
-              </w:rPr>
-              <w:t xml:space="preserve">iÉÉ¤ÉþUÉÈ | </w:t>
+          </w:p>
+        </w:tc>
+      </w:tr>
+      <w:tr>
+        <w:trPr>
+          <w:trHeight w:val="2756"/>
+        </w:trPr>
+        <w:tc>
+          <w:tcPr>
+            <w:tcW w:w="7166" w:type="dxa"/>
+          </w:tcPr>
+          <w:p>
+            <w:pPr>
+              <w:autoSpaceDE w:val="0"/>
+              <w:autoSpaceDN w:val="0"/>
+              <w:adjustRightInd w:val="0"/>
+              <w:rPr>
+                <w:rFonts w:ascii="Latha" w:hAnsi="Latha" w:cs="Latha"/>
+                <w:szCs w:val="28"/>
+                <w:lang w:bidi="ta-IN"/>
+              </w:rPr>
+            </w:pPr>
+            <w:r>
+              <w:rPr>
+                <w:rFonts w:cs="Latha"/>
+                <w:b/>
+                <w:bCs/>
+                <w:szCs w:val="28"/>
+                <w:cs/>
+                <w:lang w:bidi="ta-IN"/>
+              </w:rPr>
+              <w:t>22)</w:t>
+            </w:r>
+            <w:r>
+              <w:rPr>
+                <w:rFonts w:ascii="Latha" w:hAnsi="Latha" w:cs="Latha"/>
+                <w:szCs w:val="28"/>
+                <w:lang w:bidi="ta-IN"/>
+              </w:rPr>
+              <w:tab/>
+            </w:r>
+            <w:r>
+              <w:rPr>
+                <w:rFonts w:cs="Latha"/>
+                <w:b/>
+                <w:bCs/>
+                <w:szCs w:val="28"/>
+                <w:cs/>
+                <w:lang w:bidi="ta-IN"/>
+              </w:rPr>
+              <w:t>1.5</w:t>
+            </w:r>
+            <w:r>
+              <w:rPr>
+                <w:rFonts w:ascii="Latha" w:hAnsi="Latha" w:cs="Latha"/>
+                <w:b/>
+                <w:bCs/>
+                <w:sz w:val="32"/>
+                <w:szCs w:val="32"/>
+                <w:lang w:bidi="ta-IN"/>
+              </w:rPr>
+              <w:t>.</w:t>
+            </w:r>
+            <w:r>
+              <w:rPr>
+                <w:rFonts w:cs="Latha"/>
+                <w:b/>
+                <w:bCs/>
+                <w:szCs w:val="28"/>
+                <w:cs/>
+                <w:lang w:bidi="ta-IN"/>
+              </w:rPr>
+              <w:t>9</w:t>
+            </w:r>
+            <w:r>
+              <w:rPr>
+                <w:rFonts w:ascii="Latha" w:hAnsi="Latha" w:cs="Latha"/>
+                <w:b/>
+                <w:bCs/>
+                <w:sz w:val="32"/>
+                <w:szCs w:val="32"/>
+                <w:lang w:bidi="ta-IN"/>
+              </w:rPr>
+              <w:t>.</w:t>
+            </w:r>
+            <w:r>
+              <w:rPr>
+                <w:rFonts w:cs="Latha"/>
+                <w:b/>
+                <w:bCs/>
+                <w:szCs w:val="28"/>
+                <w:cs/>
+                <w:lang w:bidi="ta-IN"/>
+              </w:rPr>
+              <w:t>7</w:t>
+            </w:r>
+            <w:r>
+              <w:rPr>
+                <w:rFonts w:cs="Latha"/>
+                <w:b/>
+                <w:bCs/>
+                <w:szCs w:val="28"/>
+                <w:lang w:bidi="ta-IN"/>
+              </w:rPr>
+              <w:t>(</w:t>
+            </w:r>
+            <w:r>
+              <w:rPr>
+                <w:rFonts w:cs="Latha"/>
+                <w:b/>
+                <w:bCs/>
+                <w:szCs w:val="28"/>
+                <w:cs/>
+                <w:lang w:bidi="ta-IN"/>
+              </w:rPr>
+              <w:t>16</w:t>
+            </w:r>
+            <w:r>
+              <w:rPr>
+                <w:rFonts w:cs="Latha"/>
+                <w:b/>
+                <w:bCs/>
+                <w:szCs w:val="28"/>
+                <w:lang w:bidi="ta-IN"/>
+              </w:rPr>
+              <w:t>)</w:t>
+            </w:r>
+            <w:r>
+              <w:rPr>
+                <w:rFonts w:ascii="Latha" w:hAnsi="Latha" w:cs="Latha"/>
+                <w:szCs w:val="28"/>
+                <w:lang w:bidi="ta-IN"/>
+              </w:rPr>
+              <w:t xml:space="preserve">-  </w:t>
+            </w:r>
+            <w:r>
+              <w:rPr>
+                <w:rFonts w:ascii="Latha" w:hAnsi="Latha" w:cs="Latha"/>
+                <w:szCs w:val="28"/>
+                <w:cs/>
+                <w:lang w:bidi="ta-IN"/>
+              </w:rPr>
+              <w:t xml:space="preserve">தான் </w:t>
+            </w:r>
+            <w:r>
+              <w:rPr>
+                <w:rFonts w:ascii="Latha" w:hAnsi="Latha" w:cs="Latha"/>
+                <w:szCs w:val="28"/>
+                <w:lang w:bidi="ta-IN"/>
+              </w:rPr>
+              <w:t xml:space="preserve">| </w:t>
+            </w:r>
+            <w:r>
+              <w:rPr>
+                <w:rFonts w:ascii="Latha" w:hAnsi="Latha" w:cs="Latha"/>
+                <w:szCs w:val="28"/>
+                <w:cs/>
+                <w:lang w:bidi="ta-IN"/>
+              </w:rPr>
+              <w:t>ச</w:t>
+            </w:r>
+            <w:r>
+              <w:rPr>
+                <w:rFonts w:ascii="Latha" w:hAnsi="Latha" w:cs="Latha"/>
+                <w:b/>
+                <w:bCs/>
+                <w:position w:val="-12"/>
+                <w:szCs w:val="28"/>
+                <w:cs/>
+                <w:lang w:bidi="ta-IN"/>
+              </w:rPr>
+              <w:t>2</w:t>
+            </w:r>
+            <w:r>
+              <w:rPr>
+                <w:rFonts w:ascii="Latha" w:hAnsi="Latha" w:cs="Latha"/>
+                <w:szCs w:val="28"/>
+                <w:cs/>
+                <w:lang w:bidi="ta-IN"/>
+              </w:rPr>
+              <w:t>ந்தோ</w:t>
+            </w:r>
+            <w:r>
+              <w:rPr>
+                <w:rFonts w:ascii="BRH Tamil Tab Extra" w:hAnsi="BRH Tamil Tab Extra" w:cs="Latha"/>
+                <w:b/>
+                <w:bCs/>
+                <w:sz w:val="32"/>
+                <w:szCs w:val="28"/>
+                <w:lang w:bidi="ta-IN"/>
+              </w:rPr>
+              <w:t>†</w:t>
+            </w:r>
+            <w:r>
+              <w:rPr>
+                <w:rFonts w:ascii="Latha" w:hAnsi="Latha" w:cs="Latha"/>
+                <w:b/>
+                <w:bCs/>
+                <w:position w:val="-12"/>
+                <w:szCs w:val="28"/>
+                <w:cs/>
+                <w:lang w:bidi="ta-IN"/>
+              </w:rPr>
+              <w:t>3</w:t>
+            </w:r>
+            <w:r>
+              <w:rPr>
+                <w:rFonts w:ascii="Latha" w:hAnsi="Latha" w:cs="Latha"/>
+                <w:szCs w:val="28"/>
+                <w:cs/>
+                <w:lang w:bidi="ta-IN"/>
+              </w:rPr>
+              <w:t>பி</w:t>
+            </w:r>
+            <w:r>
+              <w:rPr>
+                <w:rFonts w:ascii="Latha" w:hAnsi="Latha" w:cs="Latha"/>
+                <w:b/>
+                <w:bCs/>
+                <w:position w:val="-12"/>
+                <w:szCs w:val="28"/>
+                <w:cs/>
+                <w:lang w:bidi="ta-IN"/>
+              </w:rPr>
+              <w:t>4</w:t>
+            </w:r>
+            <w:r>
+              <w:rPr>
+                <w:rFonts w:cs="Latha"/>
+                <w:b/>
+                <w:bCs/>
+                <w:szCs w:val="28"/>
+                <w:cs/>
+                <w:lang w:bidi="ta-IN"/>
+              </w:rPr>
+              <w:t>:</w:t>
+            </w:r>
+            <w:r>
+              <w:rPr>
+                <w:rFonts w:ascii="Latha" w:hAnsi="Latha" w:cs="Latha"/>
+                <w:szCs w:val="28"/>
+                <w:cs/>
+                <w:lang w:bidi="ta-IN"/>
+              </w:rPr>
+              <w:t xml:space="preserve"> </w:t>
+            </w:r>
+            <w:r>
+              <w:rPr>
+                <w:rFonts w:ascii="Latha" w:hAnsi="Latha" w:cs="Latha"/>
+                <w:szCs w:val="28"/>
+                <w:lang w:bidi="ta-IN"/>
+              </w:rPr>
+              <w:t xml:space="preserve">| </w:t>
+            </w:r>
+            <w:r>
+              <w:rPr>
+                <w:rFonts w:cs="Latha"/>
+                <w:b/>
+                <w:bCs/>
+                <w:szCs w:val="28"/>
+                <w:lang w:bidi="ta-IN"/>
+              </w:rPr>
+              <w:t>(</w:t>
+            </w:r>
+            <w:r>
+              <w:rPr>
+                <w:rFonts w:cs="Latha"/>
+                <w:b/>
+                <w:bCs/>
+                <w:szCs w:val="28"/>
+                <w:lang w:bidi="ta-IN"/>
+              </w:rPr>
+              <w:t>GS-</w:t>
+            </w:r>
+            <w:r>
+              <w:rPr>
+                <w:rFonts w:cs="Latha"/>
+                <w:b/>
+                <w:bCs/>
+                <w:szCs w:val="28"/>
+                <w:cs/>
+                <w:lang w:bidi="ta-IN"/>
+              </w:rPr>
+              <w:t>1.5</w:t>
+            </w:r>
+            <w:r>
+              <w:rPr>
+                <w:rFonts w:ascii="Latha" w:hAnsi="Latha" w:cs="Latha"/>
+                <w:szCs w:val="28"/>
+                <w:lang w:bidi="ta-IN"/>
+              </w:rPr>
+              <w:t>-</w:t>
+            </w:r>
+            <w:r>
+              <w:rPr>
+                <w:rFonts w:cs="Latha"/>
+                <w:b/>
+                <w:bCs/>
+                <w:szCs w:val="28"/>
+                <w:cs/>
+                <w:lang w:bidi="ta-IN"/>
+              </w:rPr>
+              <w:t>65</w:t>
+            </w:r>
+            <w:r>
+              <w:rPr>
+                <w:rFonts w:cs="Latha"/>
+                <w:b/>
+                <w:bCs/>
+                <w:szCs w:val="28"/>
+                <w:lang w:bidi="ta-IN"/>
+              </w:rPr>
+              <w:t>)</w:t>
             </w:r>
           </w:p>
           <w:p>
             <w:pPr>
-              <w:widowControl w:val="0"/>
               <w:autoSpaceDE w:val="0"/>
               <w:autoSpaceDN w:val="0"/>
               <w:adjustRightInd w:val="0"/>
-              <w:spacing w:before="0" w:line="240" w:lineRule="auto"/>
-              <w:rPr>
-                <w:rFonts w:cs="BRH Malayalam Extra"/>
-                <w:szCs w:val="40"/>
+              <w:rPr>
+                <w:rFonts w:cs="Latha"/>
+                <w:b/>
+                <w:bCs/>
+                <w:szCs w:val="28"/>
+                <w:cs/>
+                <w:lang w:bidi="ta-IN"/>
               </w:rPr>
             </w:pPr>
+            <w:r>
+              <w:rPr>
+                <w:rFonts w:ascii="Latha" w:hAnsi="Latha" w:cs="Latha"/>
+                <w:szCs w:val="28"/>
+                <w:cs/>
+                <w:lang w:bidi="ta-IN"/>
+              </w:rPr>
+              <w:t>தா</w:t>
+            </w:r>
+            <w:r>
+              <w:rPr>
+                <w:rFonts w:ascii="Latha" w:hAnsi="Latha" w:cs="Latha"/>
+                <w:szCs w:val="28"/>
+                <w:highlight w:val="yellow"/>
+                <w:cs/>
+                <w:lang w:bidi="ta-IN"/>
+              </w:rPr>
+              <w:t>ன்</w:t>
+            </w:r>
+            <w:r>
+              <w:rPr>
+                <w:rFonts w:ascii="Latha" w:hAnsi="Latha" w:cs="Latha"/>
+                <w:szCs w:val="28"/>
+                <w:cs/>
+                <w:lang w:bidi="ta-IN"/>
+              </w:rPr>
+              <w:t xml:space="preserve"> ச</w:t>
+            </w:r>
+            <w:r>
+              <w:rPr>
+                <w:rFonts w:ascii="Latha" w:hAnsi="Latha" w:cs="Latha"/>
+                <w:b/>
+                <w:bCs/>
+                <w:position w:val="-12"/>
+                <w:szCs w:val="28"/>
+                <w:cs/>
+                <w:lang w:bidi="ta-IN"/>
+              </w:rPr>
+              <w:t>2</w:t>
+            </w:r>
+            <w:r>
+              <w:rPr>
+                <w:rFonts w:ascii="Latha" w:hAnsi="Latha" w:cs="Latha"/>
+                <w:szCs w:val="28"/>
+                <w:cs/>
+                <w:lang w:bidi="ta-IN"/>
+              </w:rPr>
+              <w:t>ந்தோ</w:t>
+            </w:r>
+            <w:r>
+              <w:rPr>
+                <w:rFonts w:ascii="BRH Tamil Tab Extra" w:hAnsi="BRH Tamil Tab Extra" w:cs="Latha"/>
+                <w:b/>
+                <w:bCs/>
+                <w:sz w:val="32"/>
+                <w:szCs w:val="28"/>
+                <w:lang w:bidi="ta-IN"/>
+              </w:rPr>
+              <w:t>†</w:t>
+            </w:r>
+            <w:r>
+              <w:rPr>
+                <w:rFonts w:ascii="Latha" w:hAnsi="Latha" w:cs="Latha"/>
+                <w:b/>
+                <w:bCs/>
+                <w:position w:val="-12"/>
+                <w:szCs w:val="28"/>
+                <w:cs/>
+                <w:lang w:bidi="ta-IN"/>
+              </w:rPr>
+              <w:t>3</w:t>
+            </w:r>
+            <w:r>
+              <w:rPr>
+                <w:rFonts w:ascii="Latha" w:hAnsi="Latha" w:cs="Latha"/>
+                <w:szCs w:val="28"/>
+                <w:cs/>
+                <w:lang w:bidi="ta-IN"/>
+              </w:rPr>
+              <w:t>பி</w:t>
+            </w:r>
+            <w:r>
+              <w:rPr>
+                <w:rFonts w:ascii="BRH Tamil Tab Extra" w:hAnsi="BRH Tamil Tab Extra" w:cs="Latha"/>
+                <w:b/>
+                <w:bCs/>
+                <w:sz w:val="32"/>
+                <w:szCs w:val="28"/>
+                <w:lang w:bidi="ta-IN"/>
+              </w:rPr>
+              <w:t>…</w:t>
+            </w:r>
+            <w:r>
+              <w:rPr>
+                <w:rFonts w:ascii="Latha" w:hAnsi="Latha" w:cs="Latha"/>
+                <w:b/>
+                <w:bCs/>
+                <w:position w:val="-12"/>
+                <w:szCs w:val="28"/>
+                <w:cs/>
+                <w:lang w:bidi="ta-IN"/>
+              </w:rPr>
+              <w:t>4</w:t>
+            </w:r>
+            <w:r>
+              <w:rPr>
+                <w:rFonts w:ascii="Latha" w:hAnsi="Latha" w:cs="Latha"/>
+                <w:szCs w:val="28"/>
+                <w:cs/>
+                <w:lang w:bidi="ta-IN"/>
+              </w:rPr>
+              <w:t xml:space="preserve"> ஶ்ச</w:t>
+            </w:r>
+            <w:r>
+              <w:rPr>
+                <w:rFonts w:ascii="Latha" w:hAnsi="Latha" w:cs="Latha"/>
+                <w:b/>
+                <w:bCs/>
+                <w:position w:val="-12"/>
+                <w:szCs w:val="28"/>
+                <w:cs/>
+                <w:lang w:bidi="ta-IN"/>
+              </w:rPr>
+              <w:t>2</w:t>
+            </w:r>
+            <w:r>
+              <w:rPr>
+                <w:rFonts w:ascii="Latha" w:hAnsi="Latha" w:cs="Latha"/>
+                <w:szCs w:val="28"/>
+                <w:cs/>
+                <w:lang w:bidi="ta-IN"/>
+              </w:rPr>
+              <w:t>ந்தோ</w:t>
+            </w:r>
+            <w:r>
+              <w:rPr>
+                <w:rFonts w:ascii="BRH Tamil Tab Extra" w:hAnsi="BRH Tamil Tab Extra" w:cs="Latha"/>
+                <w:b/>
+                <w:bCs/>
+                <w:sz w:val="32"/>
+                <w:szCs w:val="28"/>
+                <w:lang w:bidi="ta-IN"/>
+              </w:rPr>
+              <w:t>†</w:t>
+            </w:r>
+            <w:r>
+              <w:rPr>
+                <w:rFonts w:ascii="Latha" w:hAnsi="Latha" w:cs="Latha"/>
+                <w:b/>
+                <w:bCs/>
+                <w:position w:val="-12"/>
+                <w:szCs w:val="28"/>
+                <w:cs/>
+                <w:lang w:bidi="ta-IN"/>
+              </w:rPr>
+              <w:t>3</w:t>
+            </w:r>
+            <w:r>
+              <w:rPr>
+                <w:rFonts w:ascii="Latha" w:hAnsi="Latha" w:cs="Latha"/>
+                <w:szCs w:val="28"/>
+                <w:cs/>
+                <w:lang w:bidi="ta-IN"/>
+              </w:rPr>
+              <w:t>பி</w:t>
+            </w:r>
+            <w:r>
+              <w:rPr>
+                <w:rFonts w:ascii="BRH Tamil Tab Extra" w:hAnsi="BRH Tamil Tab Extra" w:cs="Latha"/>
+                <w:b/>
+                <w:bCs/>
+                <w:sz w:val="32"/>
+                <w:szCs w:val="28"/>
+                <w:lang w:bidi="ta-IN"/>
+              </w:rPr>
+              <w:t>…</w:t>
+            </w:r>
+            <w:r>
+              <w:rPr>
+                <w:rFonts w:ascii="Latha" w:hAnsi="Latha" w:cs="Latha"/>
+                <w:b/>
+                <w:bCs/>
+                <w:position w:val="-12"/>
+                <w:szCs w:val="28"/>
+                <w:cs/>
+                <w:lang w:bidi="ta-IN"/>
+              </w:rPr>
+              <w:t>4</w:t>
+            </w:r>
+            <w:r>
+              <w:rPr>
+                <w:rFonts w:ascii="Latha" w:hAnsi="Latha" w:cs="Latha"/>
+                <w:szCs w:val="28"/>
+                <w:cs/>
+                <w:lang w:bidi="ta-IN"/>
+              </w:rPr>
+              <w:t xml:space="preserve"> ஸ்தா</w:t>
+            </w:r>
+            <w:r>
+              <w:rPr>
+                <w:rFonts w:ascii="BRH Devanagari Extra" w:hAnsi="BRH Devanagari Extra" w:cs="Latha"/>
+                <w:b/>
+                <w:bCs/>
+                <w:sz w:val="28"/>
+                <w:szCs w:val="28"/>
+                <w:lang w:bidi="ta-IN"/>
+              </w:rPr>
+              <w:t>ò</w:t>
+            </w:r>
+            <w:r>
+              <w:rPr>
+                <w:rFonts w:ascii="Latha" w:hAnsi="Latha" w:cs="Latha"/>
+                <w:szCs w:val="28"/>
+                <w:lang w:bidi="ta-IN"/>
+              </w:rPr>
+              <w:t xml:space="preserve"> </w:t>
+            </w:r>
+            <w:r>
+              <w:rPr>
+                <w:rFonts w:ascii="Latha" w:hAnsi="Latha" w:cs="Latha"/>
+                <w:szCs w:val="28"/>
+                <w:cs/>
+                <w:lang w:bidi="ta-IN"/>
+              </w:rPr>
+              <w:t>ஸ்தா</w:t>
+            </w:r>
+            <w:r>
+              <w:rPr>
+                <w:rFonts w:ascii="Latha" w:hAnsi="Latha" w:cs="Latha"/>
+                <w:szCs w:val="28"/>
+                <w:highlight w:val="yellow"/>
+                <w:cs/>
+                <w:lang w:bidi="ta-IN"/>
+              </w:rPr>
+              <w:t>ன்</w:t>
+            </w:r>
+            <w:r>
+              <w:rPr>
+                <w:rFonts w:ascii="Latha" w:hAnsi="Latha" w:cs="Latha"/>
+                <w:szCs w:val="28"/>
+                <w:cs/>
+                <w:lang w:bidi="ta-IN"/>
+              </w:rPr>
+              <w:t xml:space="preserve"> ச</w:t>
+            </w:r>
+            <w:r>
+              <w:rPr>
+                <w:rFonts w:ascii="Latha" w:hAnsi="Latha" w:cs="Latha"/>
+                <w:b/>
+                <w:bCs/>
+                <w:position w:val="-12"/>
+                <w:szCs w:val="28"/>
+                <w:cs/>
+                <w:lang w:bidi="ta-IN"/>
+              </w:rPr>
+              <w:t>2</w:t>
+            </w:r>
+            <w:r>
+              <w:rPr>
+                <w:rFonts w:ascii="Latha" w:hAnsi="Latha" w:cs="Latha"/>
+                <w:szCs w:val="28"/>
+                <w:cs/>
+                <w:lang w:bidi="ta-IN"/>
+              </w:rPr>
+              <w:t>ந்தோ</w:t>
+            </w:r>
+            <w:r>
+              <w:rPr>
+                <w:rFonts w:ascii="BRH Tamil Tab Extra" w:hAnsi="BRH Tamil Tab Extra" w:cs="Latha"/>
+                <w:b/>
+                <w:bCs/>
+                <w:sz w:val="32"/>
+                <w:szCs w:val="28"/>
+                <w:lang w:bidi="ta-IN"/>
+              </w:rPr>
+              <w:t>†</w:t>
+            </w:r>
+            <w:r>
+              <w:rPr>
+                <w:rFonts w:ascii="Latha" w:hAnsi="Latha" w:cs="Latha"/>
+                <w:b/>
+                <w:bCs/>
+                <w:position w:val="-12"/>
+                <w:szCs w:val="28"/>
+                <w:cs/>
+                <w:lang w:bidi="ta-IN"/>
+              </w:rPr>
+              <w:t>3</w:t>
+            </w:r>
+            <w:r>
+              <w:rPr>
+                <w:rFonts w:ascii="Latha" w:hAnsi="Latha" w:cs="Latha"/>
+                <w:szCs w:val="28"/>
+                <w:cs/>
+                <w:lang w:bidi="ta-IN"/>
+              </w:rPr>
+              <w:t>பி</w:t>
+            </w:r>
+            <w:r>
+              <w:rPr>
+                <w:rFonts w:ascii="Latha" w:hAnsi="Latha" w:cs="Latha"/>
+                <w:b/>
+                <w:bCs/>
+                <w:position w:val="-12"/>
+                <w:szCs w:val="28"/>
+                <w:cs/>
+                <w:lang w:bidi="ta-IN"/>
+              </w:rPr>
+              <w:t>4</w:t>
+            </w:r>
+            <w:r>
+              <w:rPr>
+                <w:rFonts w:cs="Latha"/>
+                <w:b/>
+                <w:bCs/>
+                <w:szCs w:val="28"/>
+                <w:cs/>
+                <w:lang w:bidi="ta-IN"/>
+              </w:rPr>
+              <w:t>:</w:t>
+            </w:r>
+            <w:r>
+              <w:rPr>
+                <w:rFonts w:ascii="Latha" w:hAnsi="Latha" w:cs="Latha"/>
+                <w:szCs w:val="28"/>
+                <w:cs/>
+                <w:lang w:bidi="ta-IN"/>
+              </w:rPr>
+              <w:t xml:space="preserve"> </w:t>
+            </w:r>
+            <w:r>
+              <w:rPr>
+                <w:rFonts w:ascii="Latha" w:hAnsi="Latha" w:cs="Latha"/>
+                <w:szCs w:val="28"/>
+                <w:lang w:bidi="ta-IN"/>
+              </w:rPr>
+              <w:t>|</w:t>
+            </w:r>
+          </w:p>
+        </w:tc>
+        <w:tc>
+          <w:tcPr>
+            <w:tcW w:w="7229" w:type="dxa"/>
+          </w:tcPr>
+          <w:p>
+            <w:pPr>
+              <w:autoSpaceDE w:val="0"/>
+              <w:autoSpaceDN w:val="0"/>
+              <w:adjustRightInd w:val="0"/>
+              <w:rPr>
+                <w:rFonts w:ascii="Latha" w:hAnsi="Latha" w:cs="Latha"/>
+                <w:szCs w:val="28"/>
+                <w:lang w:bidi="ta-IN"/>
+              </w:rPr>
+            </w:pPr>
+            <w:r>
+              <w:rPr>
+                <w:rFonts w:cs="Latha"/>
+                <w:b/>
+                <w:bCs/>
+                <w:szCs w:val="28"/>
+                <w:cs/>
+                <w:lang w:bidi="ta-IN"/>
+              </w:rPr>
+              <w:t>22)</w:t>
+            </w:r>
+            <w:r>
+              <w:rPr>
+                <w:rFonts w:ascii="Latha" w:hAnsi="Latha" w:cs="Latha"/>
+                <w:szCs w:val="28"/>
+                <w:lang w:bidi="ta-IN"/>
+              </w:rPr>
+              <w:tab/>
+            </w:r>
+            <w:r>
+              <w:rPr>
+                <w:rFonts w:cs="Latha"/>
+                <w:b/>
+                <w:bCs/>
+                <w:szCs w:val="28"/>
+                <w:cs/>
+                <w:lang w:bidi="ta-IN"/>
+              </w:rPr>
+              <w:t>1.5</w:t>
+            </w:r>
+            <w:r>
+              <w:rPr>
+                <w:rFonts w:ascii="Latha" w:hAnsi="Latha" w:cs="Latha"/>
+                <w:b/>
+                <w:bCs/>
+                <w:sz w:val="32"/>
+                <w:szCs w:val="32"/>
+                <w:lang w:bidi="ta-IN"/>
+              </w:rPr>
+              <w:t>.</w:t>
+            </w:r>
+            <w:r>
+              <w:rPr>
+                <w:rFonts w:cs="Latha"/>
+                <w:b/>
+                <w:bCs/>
+                <w:szCs w:val="28"/>
+                <w:cs/>
+                <w:lang w:bidi="ta-IN"/>
+              </w:rPr>
+              <w:t>9</w:t>
+            </w:r>
+            <w:r>
+              <w:rPr>
+                <w:rFonts w:ascii="Latha" w:hAnsi="Latha" w:cs="Latha"/>
+                <w:b/>
+                <w:bCs/>
+                <w:sz w:val="32"/>
+                <w:szCs w:val="32"/>
+                <w:lang w:bidi="ta-IN"/>
+              </w:rPr>
+              <w:t>.</w:t>
+            </w:r>
+            <w:r>
+              <w:rPr>
+                <w:rFonts w:cs="Latha"/>
+                <w:b/>
+                <w:bCs/>
+                <w:szCs w:val="28"/>
+                <w:cs/>
+                <w:lang w:bidi="ta-IN"/>
+              </w:rPr>
+              <w:t>7</w:t>
+            </w:r>
+            <w:r>
+              <w:rPr>
+                <w:rFonts w:cs="Latha"/>
+                <w:b/>
+                <w:bCs/>
+                <w:szCs w:val="28"/>
+                <w:lang w:bidi="ta-IN"/>
+              </w:rPr>
+              <w:t>(</w:t>
+            </w:r>
+            <w:r>
+              <w:rPr>
+                <w:rFonts w:cs="Latha"/>
+                <w:b/>
+                <w:bCs/>
+                <w:szCs w:val="28"/>
+                <w:cs/>
+                <w:lang w:bidi="ta-IN"/>
+              </w:rPr>
+              <w:t>16</w:t>
+            </w:r>
+            <w:r>
+              <w:rPr>
+                <w:rFonts w:cs="Latha"/>
+                <w:b/>
+                <w:bCs/>
+                <w:szCs w:val="28"/>
+                <w:lang w:bidi="ta-IN"/>
+              </w:rPr>
+              <w:t>)</w:t>
+            </w:r>
+            <w:r>
+              <w:rPr>
+                <w:rFonts w:ascii="Latha" w:hAnsi="Latha" w:cs="Latha"/>
+                <w:szCs w:val="28"/>
+                <w:lang w:bidi="ta-IN"/>
+              </w:rPr>
+              <w:t xml:space="preserve">-  </w:t>
+            </w:r>
+            <w:r>
+              <w:rPr>
+                <w:rFonts w:ascii="Latha" w:hAnsi="Latha" w:cs="Latha"/>
+                <w:szCs w:val="28"/>
+                <w:cs/>
+                <w:lang w:bidi="ta-IN"/>
+              </w:rPr>
+              <w:t xml:space="preserve">தான் </w:t>
+            </w:r>
+            <w:r>
+              <w:rPr>
+                <w:rFonts w:ascii="Latha" w:hAnsi="Latha" w:cs="Latha"/>
+                <w:szCs w:val="28"/>
+                <w:lang w:bidi="ta-IN"/>
+              </w:rPr>
+              <w:t xml:space="preserve">| </w:t>
+            </w:r>
+            <w:r>
+              <w:rPr>
+                <w:rFonts w:ascii="Latha" w:hAnsi="Latha" w:cs="Latha"/>
+                <w:szCs w:val="28"/>
+                <w:cs/>
+                <w:lang w:bidi="ta-IN"/>
+              </w:rPr>
+              <w:t>ச</w:t>
+            </w:r>
+            <w:r>
+              <w:rPr>
+                <w:rFonts w:ascii="Latha" w:hAnsi="Latha" w:cs="Latha"/>
+                <w:b/>
+                <w:bCs/>
+                <w:position w:val="-12"/>
+                <w:szCs w:val="28"/>
+                <w:cs/>
+                <w:lang w:bidi="ta-IN"/>
+              </w:rPr>
+              <w:t>2</w:t>
+            </w:r>
+            <w:r>
+              <w:rPr>
+                <w:rFonts w:ascii="Latha" w:hAnsi="Latha" w:cs="Latha"/>
+                <w:szCs w:val="28"/>
+                <w:cs/>
+                <w:lang w:bidi="ta-IN"/>
+              </w:rPr>
+              <w:t>ந்தோ</w:t>
+            </w:r>
+            <w:r>
+              <w:rPr>
+                <w:rFonts w:ascii="BRH Tamil Tab Extra" w:hAnsi="BRH Tamil Tab Extra" w:cs="Latha"/>
+                <w:b/>
+                <w:bCs/>
+                <w:sz w:val="32"/>
+                <w:szCs w:val="28"/>
+                <w:lang w:bidi="ta-IN"/>
+              </w:rPr>
+              <w:t>†</w:t>
+            </w:r>
+            <w:r>
+              <w:rPr>
+                <w:rFonts w:ascii="Latha" w:hAnsi="Latha" w:cs="Latha"/>
+                <w:b/>
+                <w:bCs/>
+                <w:position w:val="-12"/>
+                <w:szCs w:val="28"/>
+                <w:cs/>
+                <w:lang w:bidi="ta-IN"/>
+              </w:rPr>
+              <w:t>3</w:t>
+            </w:r>
+            <w:r>
+              <w:rPr>
+                <w:rFonts w:ascii="Latha" w:hAnsi="Latha" w:cs="Latha"/>
+                <w:szCs w:val="28"/>
+                <w:cs/>
+                <w:lang w:bidi="ta-IN"/>
+              </w:rPr>
+              <w:t>பி</w:t>
+            </w:r>
+            <w:r>
+              <w:rPr>
+                <w:rFonts w:ascii="Latha" w:hAnsi="Latha" w:cs="Latha"/>
+                <w:b/>
+                <w:bCs/>
+                <w:position w:val="-12"/>
+                <w:szCs w:val="28"/>
+                <w:cs/>
+                <w:lang w:bidi="ta-IN"/>
+              </w:rPr>
+              <w:t>4</w:t>
+            </w:r>
+            <w:r>
+              <w:rPr>
+                <w:rFonts w:cs="Latha"/>
+                <w:b/>
+                <w:bCs/>
+                <w:szCs w:val="28"/>
+                <w:cs/>
+                <w:lang w:bidi="ta-IN"/>
+              </w:rPr>
+              <w:t>:</w:t>
+            </w:r>
+            <w:r>
+              <w:rPr>
+                <w:rFonts w:ascii="Latha" w:hAnsi="Latha" w:cs="Latha"/>
+                <w:szCs w:val="28"/>
+                <w:cs/>
+                <w:lang w:bidi="ta-IN"/>
+              </w:rPr>
+              <w:t xml:space="preserve"> </w:t>
+            </w:r>
+            <w:r>
+              <w:rPr>
+                <w:rFonts w:ascii="Latha" w:hAnsi="Latha" w:cs="Latha"/>
+                <w:szCs w:val="28"/>
+                <w:lang w:bidi="ta-IN"/>
+              </w:rPr>
+              <w:t xml:space="preserve">| </w:t>
+            </w:r>
+            <w:r>
+              <w:rPr>
+                <w:rFonts w:cs="Latha"/>
+                <w:b/>
+                <w:bCs/>
+                <w:szCs w:val="28"/>
+                <w:lang w:bidi="ta-IN"/>
+              </w:rPr>
+              <w:t>(</w:t>
+            </w:r>
+            <w:r>
+              <w:rPr>
+                <w:rFonts w:cs="Latha"/>
+                <w:b/>
+                <w:bCs/>
+                <w:szCs w:val="28"/>
+                <w:lang w:bidi="ta-IN"/>
+              </w:rPr>
+              <w:t>GS-</w:t>
+            </w:r>
+            <w:r>
+              <w:rPr>
+                <w:rFonts w:cs="Latha"/>
+                <w:b/>
+                <w:bCs/>
+                <w:szCs w:val="28"/>
+                <w:cs/>
+                <w:lang w:bidi="ta-IN"/>
+              </w:rPr>
+              <w:t>1.5</w:t>
+            </w:r>
+            <w:r>
+              <w:rPr>
+                <w:rFonts w:ascii="Latha" w:hAnsi="Latha" w:cs="Latha"/>
+                <w:szCs w:val="28"/>
+                <w:lang w:bidi="ta-IN"/>
+              </w:rPr>
+              <w:t>-</w:t>
+            </w:r>
+            <w:r>
+              <w:rPr>
+                <w:rFonts w:cs="Latha"/>
+                <w:b/>
+                <w:bCs/>
+                <w:szCs w:val="28"/>
+                <w:cs/>
+                <w:lang w:bidi="ta-IN"/>
+              </w:rPr>
+              <w:t>65</w:t>
+            </w:r>
+            <w:r>
+              <w:rPr>
+                <w:rFonts w:cs="Latha"/>
+                <w:b/>
+                <w:bCs/>
+                <w:szCs w:val="28"/>
+                <w:lang w:bidi="ta-IN"/>
+              </w:rPr>
+              <w:t>)</w:t>
+            </w:r>
+          </w:p>
+          <w:p>
+            <w:pPr>
+              <w:autoSpaceDE w:val="0"/>
+              <w:autoSpaceDN w:val="0"/>
+              <w:adjustRightInd w:val="0"/>
+              <w:rPr>
+                <w:rFonts w:cs="Latha"/>
+                <w:b/>
+                <w:bCs/>
+                <w:szCs w:val="28"/>
+                <w:cs/>
+                <w:lang w:bidi="ta-IN"/>
+              </w:rPr>
+            </w:pPr>
+            <w:r>
+              <w:rPr>
+                <w:rFonts w:ascii="Latha" w:hAnsi="Latha" w:cs="Latha"/>
+                <w:szCs w:val="28"/>
+                <w:cs/>
+                <w:lang w:bidi="ta-IN"/>
+              </w:rPr>
+              <w:t>தா</w:t>
+            </w:r>
+            <w:r>
+              <w:rPr>
+                <w:rFonts w:ascii="Latha" w:hAnsi="Latha" w:cs="Latha"/>
+                <w:szCs w:val="28"/>
+                <w:highlight w:val="green"/>
+                <w:cs/>
+                <w:lang w:bidi="ta-IN"/>
+              </w:rPr>
+              <w:t>ஞ்</w:t>
+            </w:r>
+            <w:r>
+              <w:rPr>
+                <w:rFonts w:ascii="Latha" w:hAnsi="Latha" w:cs="Latha"/>
+                <w:szCs w:val="28"/>
+                <w:cs/>
+                <w:lang w:bidi="ta-IN"/>
+              </w:rPr>
+              <w:t xml:space="preserve"> ச</w:t>
+            </w:r>
+            <w:r>
+              <w:rPr>
+                <w:rFonts w:ascii="Latha" w:hAnsi="Latha" w:cs="Latha"/>
+                <w:b/>
+                <w:bCs/>
+                <w:position w:val="-12"/>
+                <w:szCs w:val="28"/>
+                <w:cs/>
+                <w:lang w:bidi="ta-IN"/>
+              </w:rPr>
+              <w:t>2</w:t>
+            </w:r>
+            <w:r>
+              <w:rPr>
+                <w:rFonts w:ascii="Latha" w:hAnsi="Latha" w:cs="Latha"/>
+                <w:szCs w:val="28"/>
+                <w:cs/>
+                <w:lang w:bidi="ta-IN"/>
+              </w:rPr>
+              <w:t>ந்தோ</w:t>
+            </w:r>
+            <w:r>
+              <w:rPr>
+                <w:rFonts w:ascii="BRH Tamil Tab Extra" w:hAnsi="BRH Tamil Tab Extra" w:cs="Latha"/>
+                <w:b/>
+                <w:bCs/>
+                <w:sz w:val="32"/>
+                <w:szCs w:val="28"/>
+                <w:lang w:bidi="ta-IN"/>
+              </w:rPr>
+              <w:t>†</w:t>
+            </w:r>
+            <w:r>
+              <w:rPr>
+                <w:rFonts w:ascii="Latha" w:hAnsi="Latha" w:cs="Latha"/>
+                <w:b/>
+                <w:bCs/>
+                <w:position w:val="-12"/>
+                <w:szCs w:val="28"/>
+                <w:cs/>
+                <w:lang w:bidi="ta-IN"/>
+              </w:rPr>
+              <w:t>3</w:t>
+            </w:r>
+            <w:r>
+              <w:rPr>
+                <w:rFonts w:ascii="Latha" w:hAnsi="Latha" w:cs="Latha"/>
+                <w:szCs w:val="28"/>
+                <w:cs/>
+                <w:lang w:bidi="ta-IN"/>
+              </w:rPr>
+              <w:t>பி</w:t>
+            </w:r>
+            <w:r>
+              <w:rPr>
+                <w:rFonts w:ascii="BRH Tamil Tab Extra" w:hAnsi="BRH Tamil Tab Extra" w:cs="Latha"/>
+                <w:b/>
+                <w:bCs/>
+                <w:sz w:val="32"/>
+                <w:szCs w:val="28"/>
+                <w:lang w:bidi="ta-IN"/>
+              </w:rPr>
+              <w:t>…</w:t>
+            </w:r>
+            <w:r>
+              <w:rPr>
+                <w:rFonts w:ascii="Latha" w:hAnsi="Latha" w:cs="Latha"/>
+                <w:b/>
+                <w:bCs/>
+                <w:position w:val="-12"/>
+                <w:szCs w:val="28"/>
+                <w:cs/>
+                <w:lang w:bidi="ta-IN"/>
+              </w:rPr>
+              <w:t>4</w:t>
+            </w:r>
+            <w:r>
+              <w:rPr>
+                <w:rFonts w:ascii="Latha" w:hAnsi="Latha" w:cs="Latha"/>
+                <w:szCs w:val="28"/>
+                <w:cs/>
+                <w:lang w:bidi="ta-IN"/>
+              </w:rPr>
+              <w:t xml:space="preserve"> ஶ்ச</w:t>
+            </w:r>
+            <w:r>
+              <w:rPr>
+                <w:rFonts w:ascii="Latha" w:hAnsi="Latha" w:cs="Latha"/>
+                <w:b/>
+                <w:bCs/>
+                <w:position w:val="-12"/>
+                <w:szCs w:val="28"/>
+                <w:cs/>
+                <w:lang w:bidi="ta-IN"/>
+              </w:rPr>
+              <w:t>2</w:t>
+            </w:r>
+            <w:r>
+              <w:rPr>
+                <w:rFonts w:ascii="Latha" w:hAnsi="Latha" w:cs="Latha"/>
+                <w:szCs w:val="28"/>
+                <w:cs/>
+                <w:lang w:bidi="ta-IN"/>
+              </w:rPr>
+              <w:t>ந்தோ</w:t>
+            </w:r>
+            <w:r>
+              <w:rPr>
+                <w:rFonts w:ascii="BRH Tamil Tab Extra" w:hAnsi="BRH Tamil Tab Extra" w:cs="Latha"/>
+                <w:b/>
+                <w:bCs/>
+                <w:sz w:val="32"/>
+                <w:szCs w:val="28"/>
+                <w:lang w:bidi="ta-IN"/>
+              </w:rPr>
+              <w:t>†</w:t>
+            </w:r>
+            <w:r>
+              <w:rPr>
+                <w:rFonts w:ascii="Latha" w:hAnsi="Latha" w:cs="Latha"/>
+                <w:b/>
+                <w:bCs/>
+                <w:position w:val="-12"/>
+                <w:szCs w:val="28"/>
+                <w:cs/>
+                <w:lang w:bidi="ta-IN"/>
+              </w:rPr>
+              <w:t>3</w:t>
+            </w:r>
+            <w:r>
+              <w:rPr>
+                <w:rFonts w:ascii="Latha" w:hAnsi="Latha" w:cs="Latha"/>
+                <w:szCs w:val="28"/>
+                <w:cs/>
+                <w:lang w:bidi="ta-IN"/>
+              </w:rPr>
+              <w:t>பி</w:t>
+            </w:r>
+            <w:r>
+              <w:rPr>
+                <w:rFonts w:ascii="BRH Tamil Tab Extra" w:hAnsi="BRH Tamil Tab Extra" w:cs="Latha"/>
+                <w:b/>
+                <w:bCs/>
+                <w:sz w:val="32"/>
+                <w:szCs w:val="28"/>
+                <w:lang w:bidi="ta-IN"/>
+              </w:rPr>
+              <w:t>…</w:t>
+            </w:r>
+            <w:r>
+              <w:rPr>
+                <w:rFonts w:ascii="Latha" w:hAnsi="Latha" w:cs="Latha"/>
+                <w:b/>
+                <w:bCs/>
+                <w:position w:val="-12"/>
+                <w:szCs w:val="28"/>
+                <w:cs/>
+                <w:lang w:bidi="ta-IN"/>
+              </w:rPr>
+              <w:t>4</w:t>
+            </w:r>
+            <w:r>
+              <w:rPr>
+                <w:rFonts w:ascii="Latha" w:hAnsi="Latha" w:cs="Latha"/>
+                <w:szCs w:val="28"/>
+                <w:cs/>
+                <w:lang w:bidi="ta-IN"/>
+              </w:rPr>
+              <w:t xml:space="preserve"> ஸ்தா</w:t>
+            </w:r>
+            <w:r>
+              <w:rPr>
+                <w:rFonts w:ascii="BRH Devanagari Extra" w:hAnsi="BRH Devanagari Extra" w:cs="Latha"/>
+                <w:b/>
+                <w:bCs/>
+                <w:sz w:val="28"/>
+                <w:szCs w:val="28"/>
+                <w:lang w:bidi="ta-IN"/>
+              </w:rPr>
+              <w:t>ò</w:t>
+            </w:r>
+            <w:r>
+              <w:rPr>
+                <w:rFonts w:ascii="Latha" w:hAnsi="Latha" w:cs="Latha"/>
+                <w:szCs w:val="28"/>
+                <w:lang w:bidi="ta-IN"/>
+              </w:rPr>
+              <w:t xml:space="preserve"> </w:t>
+            </w:r>
+            <w:r>
+              <w:rPr>
+                <w:rFonts w:ascii="Latha" w:hAnsi="Latha" w:cs="Latha"/>
+                <w:szCs w:val="28"/>
+                <w:cs/>
+                <w:lang w:bidi="ta-IN"/>
+              </w:rPr>
+              <w:t>ஸ்தா</w:t>
+            </w:r>
+            <w:r>
+              <w:rPr>
+                <w:rFonts w:ascii="Latha" w:hAnsi="Latha" w:cs="Latha"/>
+                <w:szCs w:val="28"/>
+                <w:highlight w:val="green"/>
+                <w:cs/>
+                <w:lang w:bidi="ta-IN"/>
+              </w:rPr>
+              <w:t>ஞ்</w:t>
+            </w:r>
+            <w:r>
+              <w:rPr>
+                <w:rFonts w:ascii="Latha" w:hAnsi="Latha" w:cs="Latha"/>
+                <w:szCs w:val="28"/>
+                <w:cs/>
+                <w:lang w:bidi="ta-IN"/>
+              </w:rPr>
+              <w:t xml:space="preserve"> ச</w:t>
+            </w:r>
+            <w:r>
+              <w:rPr>
+                <w:rFonts w:ascii="Latha" w:hAnsi="Latha" w:cs="Latha"/>
+                <w:b/>
+                <w:bCs/>
+                <w:position w:val="-12"/>
+                <w:szCs w:val="28"/>
+                <w:cs/>
+                <w:lang w:bidi="ta-IN"/>
+              </w:rPr>
+              <w:t>2</w:t>
+            </w:r>
+            <w:r>
+              <w:rPr>
+                <w:rFonts w:ascii="Latha" w:hAnsi="Latha" w:cs="Latha"/>
+                <w:szCs w:val="28"/>
+                <w:cs/>
+                <w:lang w:bidi="ta-IN"/>
+              </w:rPr>
+              <w:t>ந்தோ</w:t>
+            </w:r>
+            <w:r>
+              <w:rPr>
+                <w:rFonts w:ascii="BRH Tamil Tab Extra" w:hAnsi="BRH Tamil Tab Extra" w:cs="Latha"/>
+                <w:b/>
+                <w:bCs/>
+                <w:sz w:val="32"/>
+                <w:szCs w:val="28"/>
+                <w:lang w:bidi="ta-IN"/>
+              </w:rPr>
+              <w:t>†</w:t>
+            </w:r>
+            <w:r>
+              <w:rPr>
+                <w:rFonts w:ascii="Latha" w:hAnsi="Latha" w:cs="Latha"/>
+                <w:b/>
+                <w:bCs/>
+                <w:position w:val="-12"/>
+                <w:szCs w:val="28"/>
+                <w:cs/>
+                <w:lang w:bidi="ta-IN"/>
+              </w:rPr>
+              <w:t>3</w:t>
+            </w:r>
+            <w:r>
+              <w:rPr>
+                <w:rFonts w:ascii="Latha" w:hAnsi="Latha" w:cs="Latha"/>
+                <w:szCs w:val="28"/>
+                <w:cs/>
+                <w:lang w:bidi="ta-IN"/>
+              </w:rPr>
+              <w:t>பி</w:t>
+            </w:r>
+            <w:r>
+              <w:rPr>
+                <w:rFonts w:ascii="Latha" w:hAnsi="Latha" w:cs="Latha"/>
+                <w:b/>
+                <w:bCs/>
+                <w:position w:val="-12"/>
+                <w:szCs w:val="28"/>
+                <w:cs/>
+                <w:lang w:bidi="ta-IN"/>
+              </w:rPr>
+              <w:t>4</w:t>
+            </w:r>
+            <w:r>
+              <w:rPr>
+                <w:rFonts w:cs="Latha"/>
+                <w:b/>
+                <w:bCs/>
+                <w:szCs w:val="28"/>
+                <w:cs/>
+                <w:lang w:bidi="ta-IN"/>
+              </w:rPr>
+              <w:t>:</w:t>
+            </w:r>
+            <w:r>
+              <w:rPr>
+                <w:rFonts w:ascii="Latha" w:hAnsi="Latha" w:cs="Latha"/>
+                <w:szCs w:val="28"/>
+                <w:cs/>
+                <w:lang w:bidi="ta-IN"/>
+              </w:rPr>
+              <w:t xml:space="preserve"> </w:t>
+            </w:r>
+            <w:r>
+              <w:rPr>
+                <w:rFonts w:ascii="Latha" w:hAnsi="Latha" w:cs="Latha"/>
+                <w:szCs w:val="28"/>
+                <w:lang w:bidi="ta-IN"/>
+              </w:rPr>
+              <w:t>|</w:t>
+            </w:r>
           </w:p>
         </w:tc>
       </w:tr>
@@ -1597,6 +3476,7 @@
           <w:sz w:val="28"/>
           <w:szCs w:val="32"/>
         </w:rPr>
+        <w:lastRenderedPageBreak/>
         <w:t>(ignore those which are already incorporated in your book’s version and date)</w:t>
       </w:r>
     </w:p>
@@ -1815,18 +3695,7 @@
                 <w:sz w:val="32"/>
                 <w:szCs w:val="40"/>
               </w:rPr>
-              <w:t>)</w:t>
-            </w:r>
-            <w:proofErr w:type="gramStart"/>
-            <w:r>
-              <w:rPr>
-                <w:rFonts w:ascii="BRH Malayalam Extra" w:hAnsi="BRH Malayalam Extra" w:cs="BRH Malayalam Extra"/>
-                <w:b/>
-                <w:bCs/>
-                <w:sz w:val="32"/>
-                <w:szCs w:val="40"/>
-              </w:rPr>
-              <w:t xml:space="preserve">-  </w:t>
+              <w:t xml:space="preserve">)-  </w:t>
             </w:r>
             <w:r>
               <w:rPr>
@@ -1840,7 +3709,6 @@
               </w:rPr>
               <w:t>ஸஹஸா</w:t>
             </w:r>
-            <w:proofErr w:type="gramEnd"/>
             <w:r>
               <w:rPr>
                 <w:rFonts w:ascii="BRH Malayalam Extra" w:hAnsi="BRH Malayalam Extra" w:cs="BRH Malayalam Extra"/>
@@ -2158,18 +4026,7 @@
                 <w:sz w:val="32"/>
                 <w:szCs w:val="40"/>
               </w:rPr>
-              <w:t>)</w:t>
-            </w:r>
-            <w:proofErr w:type="gramStart"/>
-            <w:r>
-              <w:rPr>
-                <w:rFonts w:ascii="BRH Malayalam Extra" w:hAnsi="BRH Malayalam Extra" w:cs="BRH Malayalam Extra"/>
-                <w:b/>
-                <w:bCs/>
-                <w:sz w:val="32"/>
-                <w:szCs w:val="40"/>
-              </w:rPr>
-              <w:t xml:space="preserve">-  </w:t>
+              <w:t xml:space="preserve">)-  </w:t>
             </w:r>
             <w:r>
               <w:rPr>
@@ -2183,7 +4040,6 @@
               </w:rPr>
               <w:t>ஸஹஸா</w:t>
             </w:r>
-            <w:proofErr w:type="gramEnd"/>
             <w:r>
               <w:rPr>
                 <w:rFonts w:ascii="BRH Malayalam Extra" w:hAnsi="BRH Malayalam Extra" w:cs="BRH Malayalam Extra"/>
@@ -2506,18 +4362,7 @@
                 <w:sz w:val="32"/>
                 <w:szCs w:val="40"/>
               </w:rPr>
-              <w:t>)</w:t>
-            </w:r>
-            <w:proofErr w:type="gramStart"/>
-            <w:r>
-              <w:rPr>
-                <w:rFonts w:ascii="BRH Malayalam Extra" w:hAnsi="BRH Malayalam Extra" w:cs="BRH Malayalam Extra"/>
-                <w:b/>
-                <w:bCs/>
-                <w:sz w:val="32"/>
-                <w:szCs w:val="40"/>
-              </w:rPr>
-              <w:t xml:space="preserve">-  </w:t>
+              <w:t xml:space="preserve">)-  </w:t>
             </w:r>
             <w:r>
               <w:rPr>
@@ -2531,7 +4376,6 @@
               </w:rPr>
               <w:t>பூ</w:t>
             </w:r>
-            <w:proofErr w:type="gramEnd"/>
             <w:r>
               <w:rPr>
                 <w:rFonts w:ascii="BRH Tamil Tab Extra" w:hAnsi="BRH Tamil Tab Extra" w:cs="Latha"/>
@@ -3566,7 +5410,6 @@
                 <w:cs/>
                 <w:lang w:bidi="ta-IN"/>
               </w:rPr>
-              <w:lastRenderedPageBreak/>
               <w:t>8</w:t>
             </w:r>
             <w:r>
@@ -6017,6 +7860,7 @@
                 <w:cs/>
                 <w:lang w:bidi="ta-IN"/>
               </w:rPr>
+              <w:lastRenderedPageBreak/>
               <w:t>1.5</w:t>
             </w:r>
             <w:r>
@@ -7569,7 +9413,6 @@
                 <w:cs/>
                 <w:lang w:bidi="ta-IN"/>
               </w:rPr>
-              <w:lastRenderedPageBreak/>
               <w:t>வி</w:t>
             </w:r>
             <w:r>
@@ -8432,7 +10275,6 @@
                 <w:cs/>
                 <w:lang w:bidi="ta-IN"/>
               </w:rPr>
-              <w:lastRenderedPageBreak/>
               <w:t>57</w:t>
             </w:r>
             <w:r>
@@ -9149,7 +10991,6 @@
                 <w:cs/>
                 <w:lang w:bidi="ta-IN"/>
               </w:rPr>
-              <w:lastRenderedPageBreak/>
               <w:t>வி</w:t>
             </w:r>
             <w:r>
@@ -9938,7 +11779,6 @@
                 <w:cs/>
                 <w:lang w:bidi="ta-IN"/>
               </w:rPr>
-              <w:lastRenderedPageBreak/>
               <w:t>8</w:t>
             </w:r>
             <w:r>
@@ -11024,6 +12864,7 @@
                 <w:cs/>
                 <w:lang w:bidi="ta-IN"/>
               </w:rPr>
+              <w:lastRenderedPageBreak/>
               <w:t>41</w:t>
             </w:r>
             <w:r>
@@ -11848,7 +13689,6 @@
                 <w:cs/>
                 <w:lang w:bidi="ta-IN"/>
               </w:rPr>
-              <w:lastRenderedPageBreak/>
               <w:t>13</w:t>
             </w:r>
             <w:r>
@@ -16192,6 +18032,7 @@
                 <w:cs/>
                 <w:lang w:bidi="ta-IN"/>
               </w:rPr>
+              <w:lastRenderedPageBreak/>
               <w:t>பரோ</w:t>
             </w:r>
             <w:r>
@@ -16445,7 +18286,6 @@
                 <w:cs/>
                 <w:lang w:bidi="ta-IN"/>
               </w:rPr>
-              <w:lastRenderedPageBreak/>
               <w:t>ப</w:t>
             </w:r>
             <w:r>
@@ -17421,6 +19261,7 @@
                 <w:cs/>
                 <w:lang w:bidi="ta-IN"/>
               </w:rPr>
+              <w:lastRenderedPageBreak/>
               <w:t>ப</w:t>
             </w:r>
             <w:r>
@@ -17876,7 +19717,6 @@
                 <w:cs/>
                 <w:lang w:bidi="ta-IN"/>
               </w:rPr>
-              <w:lastRenderedPageBreak/>
               <w:t>ப</w:t>
             </w:r>
             <w:r>
@@ -20028,6 +21868,7 @@
                 <w:cs/>
                 <w:lang w:bidi="ta-IN"/>
               </w:rPr>
+              <w:lastRenderedPageBreak/>
               <w:t>ம</w:t>
             </w:r>
             <w:r>
@@ -21591,6 +23432,7 @@
                 <w:cs/>
                 <w:lang w:bidi="ta-IN"/>
               </w:rPr>
+              <w:lastRenderedPageBreak/>
               <w:t>ம</w:t>
             </w:r>
             <w:r>
@@ -56266,10 +58108,10 @@
       </w:r>
     </w:p>
     <w:sectPr>
-      <w:headerReference w:type="even" r:id="rId7"/>
-      <w:headerReference w:type="default" r:id="rId8"/>
-      <w:footerReference w:type="even" r:id="rId9"/>
-      <w:footerReference w:type="default" r:id="rId10"/>
+      <w:headerReference w:type="even" r:id="rId8"/>
+      <w:headerReference w:type="default" r:id="rId9"/>
+      <w:footerReference w:type="even" r:id="rId10"/>
+      <w:footerReference w:type="default" r:id="rId11"/>
       <w:pgSz w:w="15840" w:h="12240" w:orient="landscape"/>
       <w:pgMar w:top="1440" w:right="1440" w:bottom="1440" w:left="1440" w:header="720" w:footer="720" w:gutter="0"/>
       <w:cols w:space="720"/>
@@ -56553,6 +58395,13 @@
         <w:b/>
         <w:bCs/>
       </w:rPr>
+      <w:t>www.</w:t>
+    </w:r>
+    <w:r>
+      <w:rPr>
+        <w:b/>
+        <w:bCs/>
+      </w:rPr>
       <w:t>v</w:t>
     </w:r>
     <w:r>
@@ -56560,7 +58409,14 @@
         <w:b/>
         <w:bCs/>
       </w:rPr>
-      <w:t>edavms@gmail.com</w:t>
+      <w:t>edavms</w:t>
+    </w:r>
+    <w:r>
+      <w:rPr>
+        <w:b/>
+        <w:bCs/>
+      </w:rPr>
+      <w:t>.in</w:t>
     </w:r>
     <w:r>
       <w:rPr>
@@ -56749,6 +58605,104 @@
     </w:pPr>
   </w:p>
 </w:hdr>
+</file>
+
+<file path=word/numbering.xml><?xml version="1.0" encoding="utf-8"?>
+<w:numbering xmlns:wpc="http://schemas.microsoft.com/office/word/2010/wordprocessingCanvas" xmlns:cx="http://schemas.microsoft.com/office/drawing/2014/chartex" xmlns:cx1="http://schemas.microsoft.com/office/drawing/2015/9/8/chartex" xmlns:cx2="http://schemas.microsoft.com/office/drawing/2015/10/21/chartex" xmlns:cx3="http://schemas.microsoft.com/office/drawing/2016/5/9/chartex" xmlns:cx4="http://schemas.microsoft.com/office/drawing/2016/5/10/chartex" xmlns:cx5="http://schemas.microsoft.com/office/drawing/2016/5/11/chartex" xmlns:cx6="http://schemas.microsoft.com/office/drawing/2016/5/12/chartex" xmlns:cx7="http://schemas.microsoft.com/office/drawing/2016/5/13/chartex" xmlns:cx8="http://schemas.microsoft.com/office/drawing/2016/5/14/chartex" xmlns:mc="http://schemas.openxmlformats.org/markup-compatibility/2006" xmlns:aink="http://schemas.microsoft.com/office/drawing/2016/ink" xmlns:am3d="http://schemas.microsoft.com/office/drawing/2017/model3d" xmlns:o="urn:schemas-microsoft-com:office:office" xmlns:oel="http://schemas.microsoft.com/office/2019/extlst" xmlns:r="http://schemas.openxmlformats.org/officeDocument/2006/relationships" xmlns:m="http://schemas.openxmlformats.org/officeDocument/2006/math" xmlns:v="urn:schemas-microsoft-com:vml" xmlns:wp14="http://schemas.microsoft.com/office/word/2010/wordprocessingDrawing" xmlns:wp="http://schemas.openxmlformats.org/drawingml/2006/wordprocessingDrawing" xmlns:w10="urn:schemas-microsoft-com:office:word" xmlns:w="http://schemas.openxmlformats.org/wordprocessingml/2006/main" xmlns:w14="http://schemas.microsoft.com/office/word/2010/wordml" xmlns:w15="http://schemas.microsoft.com/office/word/2012/wordml" xmlns:w16cex="http://schemas.microsoft.com/office/word/2018/wordml/cex" xmlns:w16cid="http://schemas.microsoft.com/office/word/2016/wordml/cid" xmlns:w16="http://schemas.microsoft.com/office/word/2018/wordml" xmlns:w16du="http://schemas.microsoft.com/office/word/2023/wordml/word16du" xmlns:w16sdtdh="http://schemas.microsoft.com/office/word/2020/wordml/sdtdatahash" xmlns:w16sdtfl="http://schemas.microsoft.com/office/word/2024/wordml/sdtformatlock" xmlns:w16se="http://schemas.microsoft.com/office/word/2015/wordml/symex" xmlns:wpg="http://schemas.microsoft.com/office/word/2010/wordprocessingGroup" xmlns:wpi="http://schemas.microsoft.com/office/word/2010/wordprocessingInk" xmlns:wne="http://schemas.microsoft.com/office/word/2006/wordml" xmlns:wps="http://schemas.microsoft.com/office/word/2010/wordprocessingShape" mc:Ignorable="w14 w15 w16se w16cid w16 w16cex w16sdtdh w16sdtfl w16du wp14">
+  <w:abstractNum w:abstractNumId="0" w15:restartNumberingAfterBreak="0">
+    <w:nsid w:val="47887ADE"/>
+    <w:multiLevelType w:val="hybridMultilevel"/>
+    <w:tmpl w:val="DB3E6FDC"/>
+    <w:lvl w:ilvl="0" w:tplc="2CE6E3C6">
+      <w:start w:val="1"/>
+      <w:numFmt w:val="decimal"/>
+      <w:lvlText w:val="%1)"/>
+      <w:lvlJc w:val="left"/>
+      <w:pPr>
+        <w:ind w:left="720" w:hanging="360"/>
+      </w:pPr>
+      <w:rPr>
+        <w:rFonts w:ascii="Arial" w:hAnsi="Arial" w:hint="default"/>
+        <w:b/>
+      </w:rPr>
+    </w:lvl>
+    <w:lvl w:ilvl="1" w:tplc="40090019" w:tentative="1">
+      <w:start w:val="1"/>
+      <w:numFmt w:val="lowerLetter"/>
+      <w:lvlText w:val="%2."/>
+      <w:lvlJc w:val="left"/>
+      <w:pPr>
+        <w:ind w:left="1440" w:hanging="360"/>
+      </w:pPr>
+    </w:lvl>
+    <w:lvl w:ilvl="2" w:tplc="4009001B" w:tentative="1">
+      <w:start w:val="1"/>
+      <w:numFmt w:val="lowerRoman"/>
+      <w:lvlText w:val="%3."/>
+      <w:lvlJc w:val="right"/>
+      <w:pPr>
+        <w:ind w:left="2160" w:hanging="180"/>
+      </w:pPr>
+    </w:lvl>
+    <w:lvl w:ilvl="3" w:tplc="4009000F" w:tentative="1">
+      <w:start w:val="1"/>
+      <w:numFmt w:val="decimal"/>
+      <w:lvlText w:val="%4."/>
+      <w:lvlJc w:val="left"/>
+      <w:pPr>
+        <w:ind w:left="2880" w:hanging="360"/>
+      </w:pPr>
+    </w:lvl>
+    <w:lvl w:ilvl="4" w:tplc="40090019" w:tentative="1">
+      <w:start w:val="1"/>
+      <w:numFmt w:val="lowerLetter"/>
+      <w:lvlText w:val="%5."/>
+      <w:lvlJc w:val="left"/>
+      <w:pPr>
+        <w:ind w:left="3600" w:hanging="360"/>
+      </w:pPr>
+    </w:lvl>
+    <w:lvl w:ilvl="5" w:tplc="4009001B" w:tentative="1">
+      <w:start w:val="1"/>
+      <w:numFmt w:val="lowerRoman"/>
+      <w:lvlText w:val="%6."/>
+      <w:lvlJc w:val="right"/>
+      <w:pPr>
+        <w:ind w:left="4320" w:hanging="180"/>
+      </w:pPr>
+    </w:lvl>
+    <w:lvl w:ilvl="6" w:tplc="4009000F" w:tentative="1">
+      <w:start w:val="1"/>
+      <w:numFmt w:val="decimal"/>
+      <w:lvlText w:val="%7."/>
+      <w:lvlJc w:val="left"/>
+      <w:pPr>
+        <w:ind w:left="5040" w:hanging="360"/>
+      </w:pPr>
+    </w:lvl>
+    <w:lvl w:ilvl="7" w:tplc="40090019" w:tentative="1">
+      <w:start w:val="1"/>
+      <w:numFmt w:val="lowerLetter"/>
+      <w:lvlText w:val="%8."/>
+      <w:lvlJc w:val="left"/>
+      <w:pPr>
+        <w:ind w:left="5760" w:hanging="360"/>
+      </w:pPr>
+    </w:lvl>
+    <w:lvl w:ilvl="8" w:tplc="4009001B" w:tentative="1">
+      <w:start w:val="1"/>
+      <w:numFmt w:val="lowerRoman"/>
+      <w:lvlText w:val="%9."/>
+      <w:lvlJc w:val="right"/>
+      <w:pPr>
+        <w:ind w:left="6480" w:hanging="180"/>
+      </w:pPr>
+    </w:lvl>
+  </w:abstractNum>
+  <w:num w:numId="1" w16cid:durableId="867379519">
+    <w:abstractNumId w:val="0"/>
+  </w:num>
+</w:numbering>
 </file>
 
 <file path=word/styles.xml><?xml version="1.0" encoding="utf-8"?>
@@ -57143,7 +59097,7 @@
   <w:style w:type="paragraph" w:default="1" w:styleId="Normal">
     <w:name w:val="Normal"/>
     <w:qFormat/>
-    <w:rsid w:val="00076C05"/>
+    <w:rsid w:val="003E7391"/>
     <w:pPr>
       <w:spacing w:before="120" w:line="276" w:lineRule="auto"/>
     </w:pPr>
@@ -57266,6 +59220,17 @@
       <w:szCs w:val="22"/>
       <w:lang w:val="en-US" w:eastAsia="en-US" w:bidi="ar-SA"/>
     </w:rPr>
+  </w:style>
+  <w:style w:type="paragraph" w:styleId="ListParagraph">
+    <w:name w:val="List Paragraph"/>
+    <w:basedOn w:val="Normal"/>
+    <w:uiPriority w:val="34"/>
+    <w:qFormat/>
+    <w:rsid w:val="003E7391"/>
+    <w:pPr>
+      <w:ind w:left="720"/>
+      <w:contextualSpacing/>
+    </w:pPr>
   </w:style>
 </w:styles>
 </file>

</xml_diff>